<commit_message>
Fill PRISMA 2020 template for Chapter 2
</commit_message>
<xml_diff>
--- a/report/generated/paper.docx
+++ b/report/generated/paper.docx
@@ -2,32 +2,6 @@
 <file path=word/document.xml><?xml version="1.0" encoding="utf-8"?>
 <w:document xmlns:w="http://schemas.openxmlformats.org/wordprocessingml/2006/main" xmlns:m="http://schemas.openxmlformats.org/officeDocument/2006/math" xmlns:r="http://schemas.openxmlformats.org/officeDocument/2006/relationships" xmlns:o="urn:schemas-microsoft-com:office:office" xmlns:v="urn:schemas-microsoft-com:vml" xmlns:w10="urn:schemas-microsoft-com:office:word" xmlns:a="http://schemas.openxmlformats.org/drawingml/2006/main" xmlns:pic="http://schemas.openxmlformats.org/drawingml/2006/picture" xmlns:wp="http://schemas.openxmlformats.org/drawingml/2006/wordprocessingDrawing">
   <w:body>
-    <w:sdt>
-      <w:sdtPr>
-        <w:docPartObj>
-          <w:docPartGallery w:val="Table of Contents"/>
-          <w:docPartUnique/>
-        </w:docPartObj>
-      </w:sdtPr>
-      <w:sdtContent>
-        <w:p>
-          <w:pPr>
-            <w:pStyle w:val="TOCHeading"/>
-          </w:pPr>
-          <w:r>
-            <w:t xml:space="preserve">Table of contents</w:t>
-          </w:r>
-        </w:p>
-        <w:p>
-          <w:r>
-            <w:fldChar w:fldCharType="begin" w:dirty="true"/>
-            <w:instrText xml:space="preserve">TOC \o "1-3" \h \z \u</w:instrText>
-            <w:fldChar w:fldCharType="separate"/>
-            <w:fldChar w:fldCharType="end"/>
-          </w:r>
-        </w:p>
-      </w:sdtContent>
-    </w:sdt>
     <w:p>
       <w:pPr>
         <w:pStyle w:val="Title"/>
@@ -40,6 +14,9 @@
       <w:pPr>
         <w:pStyle w:val="Title"/>
       </w:pPr>
+      <w:r>
+        <w:t xml:space="preserve">985</w:t>
+      </w:r>
     </w:p>
     <w:p>
       <w:pPr>
@@ -53,21 +30,41 @@
       <w:pPr>
         <w:pStyle w:val="Title"/>
       </w:pPr>
+      <w:r>
+        <w:t xml:space="preserve">1221303805</w:t>
+      </w:r>
     </w:p>
     <w:p>
       <w:pPr>
         <w:pStyle w:val="Title"/>
       </w:pPr>
+      <w:r>
+        <w:t xml:space="preserve">AL-SALOUL, ASHRAF ALI HUSSEIN</w:t>
+      </w:r>
     </w:p>
     <w:p>
       <w:pPr>
         <w:pStyle w:val="Title"/>
       </w:pPr>
+      <w:r>
+        <w:t xml:space="preserve">Supervisor: Arshad Jamal</w:t>
+      </w:r>
     </w:p>
     <w:p>
       <w:pPr>
         <w:pStyle w:val="Title"/>
       </w:pPr>
+      <w:r>
+        <w:t xml:space="preserve">BACHELOR OF COMPUTER SCIENCE B.CS (HONS) SOFTWARE ENGINEERING</w:t>
+      </w:r>
+    </w:p>
+    <w:p>
+      <w:pPr>
+        <w:pStyle w:val="Title"/>
+      </w:pPr>
+      <w:r>
+        <w:t xml:space="preserve">MAY 2026</w:t>
+      </w:r>
     </w:p>
     <w:p>
       <w:r>
@@ -78,6 +75,9 @@
       <w:pPr>
         <w:pStyle w:val="Title"/>
       </w:pPr>
+      <w:r>
+        <w:t xml:space="preserve">985</w:t>
+      </w:r>
     </w:p>
     <w:p>
       <w:pPr>
@@ -99,6 +99,9 @@
       <w:pPr>
         <w:pStyle w:val="Title"/>
       </w:pPr>
+      <w:r>
+        <w:t xml:space="preserve">1221303805 AL-SALOUL, ASHRAF ALI HUSSEIN</w:t>
+      </w:r>
     </w:p>
     <w:p>
       <w:pPr>
@@ -112,6 +115,17 @@
       <w:pPr>
         <w:pStyle w:val="Title"/>
       </w:pPr>
+      <w:r>
+        <w:t xml:space="preserve">BACHELOR OF COMPUTER SCIENCE B.CS (HONS) SOFTWARE ENGINEERING</w:t>
+      </w:r>
+    </w:p>
+    <w:p>
+      <w:pPr>
+        <w:pStyle w:val="Title"/>
+      </w:pPr>
+      <w:r>
+        <w:t xml:space="preserve">Supervisor: Arshad Jamal</w:t>
+      </w:r>
     </w:p>
     <w:p>
       <w:pPr>
@@ -149,8 +163,18 @@
       <w:pPr>
         <w:pStyle w:val="Title"/>
       </w:pPr>
-    </w:p>
-    <w:p>
+      <w:r>
+        <w:t xml:space="preserve">MAY 2026</w:t>
+      </w:r>
+    </w:p>
+    <w:p>
+      <w:pPr>
+        <w:sectPr>
+          <w:type w:val="continuous"/>
+          <w:pgSz w:h="15840" w:w="12240"/>
+          <w:pgMar w:top="1440" w:right="1440" w:bottom="1440" w:left="1440" w:header="720" w:footer="720" w:gutter="0"/>
+        </w:sectPr>
+      </w:pPr>
       <w:r>
         <w:br w:type="page"/>
       </w:r>
@@ -173,10 +197,7 @@
         </w:numPr>
       </w:pPr>
       <w:r>
-        <w:t xml:space="preserve"> </w:t>
-      </w:r>
-      <w:r>
-        <w:t xml:space="preserve">Universiti Telekom Sdn. Bhd. ALL RIGHTS RESERVED.</w:t>
+        <w:t xml:space="preserve">2026 Universiti Telekom Sdn. Bhd. ALL RIGHTS RESERVED.</w:t>
       </w:r>
     </w:p>
     <w:p>
@@ -215,7 +236,7 @@
         <w:pStyle w:val="BodyText"/>
       </w:pPr>
       <w:r>
-        <w:t xml:space="preserve">____________________</w:t>
+        <w:t xml:space="preserve">Name of candidate: AL-SALOUL, ASHRAF ALI HUSSEIN</w:t>
       </w:r>
     </w:p>
     <w:p>
@@ -223,7 +244,7 @@
         <w:pStyle w:val="BodyText"/>
       </w:pPr>
       <w:r>
-        <w:t xml:space="preserve">Name of candidate:</w:t>
+        <w:t xml:space="preserve">Faculty of Computing &amp; Informatics</w:t>
       </w:r>
     </w:p>
     <w:p>
@@ -231,7 +252,7 @@
         <w:pStyle w:val="BodyText"/>
       </w:pPr>
       <w:r>
-        <w:t xml:space="preserve">Faculty of Computing &amp; Informatics</w:t>
+        <w:t xml:space="preserve">Multimedia University</w:t>
       </w:r>
     </w:p>
     <w:p>
@@ -239,15 +260,7 @@
         <w:pStyle w:val="BodyText"/>
       </w:pPr>
       <w:r>
-        <w:t xml:space="preserve">Multimedia University</w:t>
-      </w:r>
-    </w:p>
-    <w:p>
-      <w:pPr>
-        <w:pStyle w:val="BodyText"/>
-      </w:pPr>
-      <w:r>
-        <w:t xml:space="preserve">Date: DD: MM: YYYY</w:t>
+        <w:t xml:space="preserve">Date:</w:t>
       </w:r>
     </w:p>
     <w:p>
@@ -270,7 +283,31 @@
         <w:pStyle w:val="FirstParagraph"/>
       </w:pPr>
       <w:r>
-        <w:t xml:space="preserve">Placeholder acknowledgements. Replace this section after supervisor details and final acknowledgement wording are confirmed.</w:t>
+        <w:t xml:space="preserve">In the name of Allah, the Most Gracious, the Most Merciful.</w:t>
+      </w:r>
+    </w:p>
+    <w:p>
+      <w:pPr>
+        <w:pStyle w:val="BodyText"/>
+      </w:pPr>
+      <w:r>
+        <w:t xml:space="preserve">I would like to express my sincere gratitude to my supervisor, Arshad Jamal, for his guidance, patience, and continuous support throughout the development of this project. His advice has been valuable in shaping both the technical and academic direction of this work.</w:t>
+      </w:r>
+    </w:p>
+    <w:p>
+      <w:pPr>
+        <w:pStyle w:val="BodyText"/>
+      </w:pPr>
+      <w:r>
+        <w:t xml:space="preserve">I am also grateful to Multimedia University and the Faculty of Computing and Informatics for providing the academic environment, resources, and support necessary to complete this project.</w:t>
+      </w:r>
+    </w:p>
+    <w:p>
+      <w:pPr>
+        <w:pStyle w:val="BodyText"/>
+      </w:pPr>
+      <w:r>
+        <w:t xml:space="preserve">Finally, I would like to thank my family, friends, and colleagues for their encouragement, patience, and moral support throughout this journey.</w:t>
       </w:r>
     </w:p>
     <w:p>
@@ -293,7 +330,27 @@
         <w:pStyle w:val="FirstParagraph"/>
       </w:pPr>
       <w:r>
-        <w:t xml:space="preserve">This placeholder abstract summarizes the planned FYP1 report for a machine learning-based system for cardiopulmonary sound separation. Replace this paragraph with the final abstract after the project scope, methodology, and expected deliverables are finalized.</w:t>
+        <w:t xml:space="preserve">This interim report presents the first phase of a Final Year Project titled</w:t>
+      </w:r>
+      <w:r>
+        <w:t xml:space="preserve"> </w:t>
+      </w:r>
+      <w:r>
+        <w:rPr>
+          <w:rStyle w:val="VerbatimChar"/>
+        </w:rPr>
+        <w:t xml:space="preserve">Machine Learning-Based System for Cardiopulmonary Sound Separation</w:t>
+      </w:r>
+      <w:r>
+        <w:t xml:space="preserve">. The project focuses on developing a software prototype that processes mixed cardiopulmonary audio and produces separated heart sound and lung sound outputs. The project is motivated by the overlap between heart and lung sounds in chest recordings and by the need for a structured, reusable software workflow for sound separation rather than disease diagnosis.</w:t>
+      </w:r>
+    </w:p>
+    <w:p>
+      <w:pPr>
+        <w:pStyle w:val="BodyText"/>
+      </w:pPr>
+      <w:r>
+        <w:t xml:space="preserve">The report introduces the project background, problem statement, objectives, scope, literature review, and proposed methodology. The planned system includes public dataset selection, audio preprocessing, feature or input representation, machine learning-based separation, output generation, and evaluation using suitable signal-level metrics. The expected outcome is a proof-of-concept software system that demonstrates cardiopulmonary sound separation while avoiding unsupported clinical claims.</w:t>
       </w:r>
     </w:p>
     <w:p>
@@ -302,12 +359,44 @@
       </w:r>
     </w:p>
     <w:bookmarkEnd w:id="21"/>
-    <w:bookmarkStart w:id="22" w:name="list-of-tables"/>
+    <w:bookmarkStart w:id="22" w:name="table-of-contents"/>
     <w:p>
       <w:pPr>
         <w:pStyle w:val="Heading1"/>
       </w:pPr>
       <w:r>
+        <w:t xml:space="preserve">Table of Contents</w:t>
+      </w:r>
+    </w:p>
+    <w:p xmlns:w="http://schemas.openxmlformats.org/wordprocessingml/2006/main">
+      <w:r>
+        <w:fldChar w:fldCharType="begin"/>
+      </w:r>
+      <w:r>
+        <w:instrText xml:space="preserve"> TOC \o "1-3" \h \z \u </w:instrText>
+      </w:r>
+      <w:r>
+        <w:fldChar w:fldCharType="separate"/>
+      </w:r>
+      <w:r>
+        <w:t>Right-click and update field to generate the table of contents.</w:t>
+      </w:r>
+      <w:r>
+        <w:fldChar w:fldCharType="end"/>
+      </w:r>
+    </w:p>
+    <w:p>
+      <w:r>
+        <w:br w:type="page"/>
+      </w:r>
+    </w:p>
+    <w:bookmarkEnd w:id="22"/>
+    <w:bookmarkStart w:id="23" w:name="list-of-tables"/>
+    <w:p>
+      <w:pPr>
+        <w:pStyle w:val="Heading1"/>
+      </w:pPr>
+      <w:r>
         <w:t xml:space="preserve">List of Tables</w:t>
       </w:r>
     </w:p>
@@ -316,7 +405,7 @@
         <w:pStyle w:val="FirstParagraph"/>
       </w:pPr>
       <w:r>
-        <w:t xml:space="preserve">This placeholder section is reserved for the generated or Word-updated list of tables.</w:t>
+        <w:t xml:space="preserve">No finalized tables have been added at this draft stage. This section should be updated after final tables are inserted.</w:t>
       </w:r>
     </w:p>
     <w:p>
@@ -324,8 +413,8 @@
         <w:br w:type="page"/>
       </w:r>
     </w:p>
-    <w:bookmarkEnd w:id="22"/>
-    <w:bookmarkStart w:id="23" w:name="list-of-figures"/>
+    <w:bookmarkEnd w:id="23"/>
+    <w:bookmarkStart w:id="24" w:name="list-of-figures"/>
     <w:p>
       <w:pPr>
         <w:pStyle w:val="Heading1"/>
@@ -339,7 +428,7 @@
         <w:pStyle w:val="FirstParagraph"/>
       </w:pPr>
       <w:r>
-        <w:t xml:space="preserve">This placeholder section is reserved for the generated or Word-updated list of figures.</w:t>
+        <w:t xml:space="preserve">No finalized figures have been added at this draft stage. This section should be updated after final figures and diagrams are inserted.</w:t>
       </w:r>
     </w:p>
     <w:p>
@@ -347,14 +436,188 @@
         <w:br w:type="page"/>
       </w:r>
     </w:p>
-    <w:bookmarkEnd w:id="23"/>
-    <w:bookmarkStart w:id="24" w:name="list-of-abbreviationssymbols"/>
+    <w:bookmarkEnd w:id="24"/>
+    <w:bookmarkStart w:id="25" w:name="list-of-abbreviationssymbols"/>
     <w:p>
       <w:pPr>
         <w:pStyle w:val="Heading1"/>
       </w:pPr>
       <w:r>
         <w:t xml:space="preserve">List of Abbreviations/Symbols</w:t>
+      </w:r>
+    </w:p>
+    <w:tbl>
+      <w:tblPr>
+        <w:tblStyle w:val="Table"/>
+        <w:tblW w:type="pct" w:w="5000"/>
+        <w:tblLayout w:type="fixed"/>
+        <w:tblLook w:firstRow="1" w:lastRow="0" w:firstColumn="0" w:lastColumn="0" w:noHBand="0" w:noVBand="0" w:val="0020"/>
+      </w:tblPr>
+      <w:tblGrid>
+        <w:gridCol w:w="3960"/>
+        <w:gridCol w:w="3960"/>
+      </w:tblGrid>
+      <w:tr>
+        <w:trPr>
+          <w:tblHeader w:val="on"/>
+        </w:trPr>
+        <w:tc>
+          <w:tcPr/>
+          <w:p>
+            <w:pPr>
+              <w:pStyle w:val="Compact"/>
+            </w:pPr>
+            <w:r>
+              <w:t xml:space="preserve">Abbreviation</w:t>
+            </w:r>
+          </w:p>
+        </w:tc>
+        <w:tc>
+          <w:tcPr/>
+          <w:p>
+            <w:pPr>
+              <w:pStyle w:val="Compact"/>
+            </w:pPr>
+            <w:r>
+              <w:t xml:space="preserve">Description</w:t>
+            </w:r>
+          </w:p>
+        </w:tc>
+      </w:tr>
+      <w:tr>
+        <w:tc>
+          <w:tcPr/>
+          <w:p>
+            <w:pPr>
+              <w:pStyle w:val="Compact"/>
+            </w:pPr>
+            <w:r>
+              <w:t xml:space="preserve">FYP</w:t>
+            </w:r>
+          </w:p>
+        </w:tc>
+        <w:tc>
+          <w:tcPr/>
+          <w:p>
+            <w:pPr>
+              <w:pStyle w:val="Compact"/>
+            </w:pPr>
+            <w:r>
+              <w:t xml:space="preserve">Final Year Project</w:t>
+            </w:r>
+          </w:p>
+        </w:tc>
+      </w:tr>
+      <w:tr>
+        <w:tc>
+          <w:tcPr/>
+          <w:p>
+            <w:pPr>
+              <w:pStyle w:val="Compact"/>
+            </w:pPr>
+            <w:r>
+              <w:t xml:space="preserve">ML</w:t>
+            </w:r>
+          </w:p>
+        </w:tc>
+        <w:tc>
+          <w:tcPr/>
+          <w:p>
+            <w:pPr>
+              <w:pStyle w:val="Compact"/>
+            </w:pPr>
+            <w:r>
+              <w:t xml:space="preserve">Machine Learning</w:t>
+            </w:r>
+          </w:p>
+        </w:tc>
+      </w:tr>
+      <w:tr>
+        <w:tc>
+          <w:tcPr/>
+          <w:p>
+            <w:pPr>
+              <w:pStyle w:val="Compact"/>
+            </w:pPr>
+            <w:r>
+              <w:t xml:space="preserve">PCG</w:t>
+            </w:r>
+          </w:p>
+        </w:tc>
+        <w:tc>
+          <w:tcPr/>
+          <w:p>
+            <w:pPr>
+              <w:pStyle w:val="Compact"/>
+            </w:pPr>
+            <w:r>
+              <w:t xml:space="preserve">Phonocardiogram</w:t>
+            </w:r>
+          </w:p>
+        </w:tc>
+      </w:tr>
+      <w:tr>
+        <w:tc>
+          <w:tcPr/>
+          <w:p>
+            <w:pPr>
+              <w:pStyle w:val="Compact"/>
+            </w:pPr>
+            <w:r>
+              <w:t xml:space="preserve">HLS-CMDS</w:t>
+            </w:r>
+          </w:p>
+        </w:tc>
+        <w:tc>
+          <w:tcPr/>
+          <w:p>
+            <w:pPr>
+              <w:pStyle w:val="Compact"/>
+            </w:pPr>
+            <w:r>
+              <w:t xml:space="preserve">Heart and Lung Sounds Dataset Recorded from a Clinical Manikin using Digital Stethoscope</w:t>
+            </w:r>
+          </w:p>
+        </w:tc>
+      </w:tr>
+      <w:tr>
+        <w:tc>
+          <w:tcPr/>
+          <w:p>
+            <w:pPr>
+              <w:pStyle w:val="Compact"/>
+            </w:pPr>
+            <w:r>
+              <w:t xml:space="preserve">DOCX</w:t>
+            </w:r>
+          </w:p>
+        </w:tc>
+        <w:tc>
+          <w:tcPr/>
+          <w:p>
+            <w:pPr>
+              <w:pStyle w:val="Compact"/>
+            </w:pPr>
+            <w:r>
+              <w:t xml:space="preserve">Microsoft Word Open XML Document</w:t>
+            </w:r>
+          </w:p>
+        </w:tc>
+      </w:tr>
+    </w:tbl>
+    <w:p>
+      <w:r>
+        <w:br w:type="page"/>
+      </w:r>
+    </w:p>
+    <w:bookmarkEnd w:id="25"/>
+    <w:bookmarkStart w:id="26" w:name="list-of-appendices"/>
+    <w:p>
+      <w:pPr>
+        <w:pStyle w:val="Heading1"/>
+      </w:pPr>
+      <w:r>
+        <w:t xml:space="preserve">List of Appendices</w:t>
       </w:r>
     </w:p>
     <w:tbl>
@@ -378,7 +641,7 @@
               <w:pStyle w:val="Compact"/>
             </w:pPr>
             <w:r>
-              <w:t xml:space="preserve">Abbreviation</w:t>
+              <w:t xml:space="preserve">Appendix</w:t>
             </w:r>
           </w:p>
         </w:tc>
@@ -402,7 +665,7 @@
               <w:pStyle w:val="Compact"/>
             </w:pPr>
             <w:r>
-              <w:t xml:space="preserve">FYP</w:t>
+              <w:t xml:space="preserve">Appendix A</w:t>
             </w:r>
           </w:p>
         </w:tc>
@@ -413,7 +676,7 @@
               <w:pStyle w:val="Compact"/>
             </w:pPr>
             <w:r>
-              <w:t xml:space="preserve">Final Year Project</w:t>
+              <w:t xml:space="preserve">Gantt Chart</w:t>
             </w:r>
           </w:p>
         </w:tc>
@@ -426,7 +689,7 @@
               <w:pStyle w:val="Compact"/>
             </w:pPr>
             <w:r>
-              <w:t xml:space="preserve">ML</w:t>
+              <w:t xml:space="preserve">Appendix B</w:t>
             </w:r>
           </w:p>
         </w:tc>
@@ -437,7 +700,7 @@
               <w:pStyle w:val="Compact"/>
             </w:pPr>
             <w:r>
-              <w:t xml:space="preserve">Machine Learning</w:t>
+              <w:t xml:space="preserve">FYP I Meeting Logs</w:t>
             </w:r>
           </w:p>
         </w:tc>
@@ -450,7 +713,7 @@
               <w:pStyle w:val="Compact"/>
             </w:pPr>
             <w:r>
-              <w:t xml:space="preserve">DOCX</w:t>
+              <w:t xml:space="preserve">Appendix C</w:t>
             </w:r>
           </w:p>
         </w:tc>
@@ -461,60 +724,7 @@
               <w:pStyle w:val="Compact"/>
             </w:pPr>
             <w:r>
-              <w:t xml:space="preserve">Microsoft Word Open XML Document</w:t>
-            </w:r>
-          </w:p>
-        </w:tc>
-      </w:tr>
-    </w:tbl>
-    <w:p>
-      <w:r>
-        <w:br w:type="page"/>
-      </w:r>
-    </w:p>
-    <w:bookmarkEnd w:id="24"/>
-    <w:bookmarkStart w:id="25" w:name="list-of-appendices"/>
-    <w:p>
-      <w:pPr>
-        <w:pStyle w:val="Heading1"/>
-      </w:pPr>
-      <w:r>
-        <w:t xml:space="preserve">List of Appendices</w:t>
-      </w:r>
-    </w:p>
-    <w:tbl>
-      <w:tblPr>
-        <w:tblStyle w:val="Table"/>
-        <w:tblW w:type="auto" w:w="0"/>
-        <w:tblLook w:firstRow="1" w:lastRow="0" w:firstColumn="0" w:lastColumn="0" w:noHBand="0" w:noVBand="0" w:val="0020"/>
-      </w:tblPr>
-      <w:tblGrid>
-        <w:gridCol w:w="3960"/>
-        <w:gridCol w:w="3960"/>
-      </w:tblGrid>
-      <w:tr>
-        <w:trPr>
-          <w:tblHeader w:val="on"/>
-        </w:trPr>
-        <w:tc>
-          <w:tcPr/>
-          <w:p>
-            <w:pPr>
-              <w:pStyle w:val="Compact"/>
-            </w:pPr>
-            <w:r>
-              <w:t xml:space="preserve">Appendix</w:t>
-            </w:r>
-          </w:p>
-        </w:tc>
-        <w:tc>
-          <w:tcPr/>
-          <w:p>
-            <w:pPr>
-              <w:pStyle w:val="Compact"/>
-            </w:pPr>
-            <w:r>
-              <w:t xml:space="preserve">Description</w:t>
+              <w:t xml:space="preserve">Turnitin Similarity Index Page</w:t>
             </w:r>
           </w:p>
         </w:tc>
@@ -527,7 +737,7 @@
               <w:pStyle w:val="Compact"/>
             </w:pPr>
             <w:r>
-              <w:t xml:space="preserve">Appendix A</w:t>
+              <w:t xml:space="preserve">Appendix D</w:t>
             </w:r>
           </w:p>
         </w:tc>
@@ -538,78 +748,6 @@
               <w:pStyle w:val="Compact"/>
             </w:pPr>
             <w:r>
-              <w:t xml:space="preserve">Gantt Chart</w:t>
-            </w:r>
-          </w:p>
-        </w:tc>
-      </w:tr>
-      <w:tr>
-        <w:tc>
-          <w:tcPr/>
-          <w:p>
-            <w:pPr>
-              <w:pStyle w:val="Compact"/>
-            </w:pPr>
-            <w:r>
-              <w:t xml:space="preserve">Appendix B</w:t>
-            </w:r>
-          </w:p>
-        </w:tc>
-        <w:tc>
-          <w:tcPr/>
-          <w:p>
-            <w:pPr>
-              <w:pStyle w:val="Compact"/>
-            </w:pPr>
-            <w:r>
-              <w:t xml:space="preserve">FYP I Meeting Logs</w:t>
-            </w:r>
-          </w:p>
-        </w:tc>
-      </w:tr>
-      <w:tr>
-        <w:tc>
-          <w:tcPr/>
-          <w:p>
-            <w:pPr>
-              <w:pStyle w:val="Compact"/>
-            </w:pPr>
-            <w:r>
-              <w:t xml:space="preserve">Appendix C</w:t>
-            </w:r>
-          </w:p>
-        </w:tc>
-        <w:tc>
-          <w:tcPr/>
-          <w:p>
-            <w:pPr>
-              <w:pStyle w:val="Compact"/>
-            </w:pPr>
-            <w:r>
-              <w:t xml:space="preserve">Turnitin Similarity Index Page</w:t>
-            </w:r>
-          </w:p>
-        </w:tc>
-      </w:tr>
-      <w:tr>
-        <w:tc>
-          <w:tcPr/>
-          <w:p>
-            <w:pPr>
-              <w:pStyle w:val="Compact"/>
-            </w:pPr>
-            <w:r>
-              <w:t xml:space="preserve">Appendix D</w:t>
-            </w:r>
-          </w:p>
-        </w:tc>
-        <w:tc>
-          <w:tcPr/>
-          <w:p>
-            <w:pPr>
-              <w:pStyle w:val="Compact"/>
-            </w:pPr>
-            <w:r>
               <w:t xml:space="preserve">Technical Documentation</w:t>
             </w:r>
           </w:p>
@@ -617,12 +755,22 @@
       </w:tr>
     </w:tbl>
     <w:p>
+      <w:pPr>
+        <w:sectPr>
+          <w:headerReference w:type="default" r:id="rId8"/>
+          <w:footerReference w:type="default" r:id="rId9"/>
+          <w:type w:val="continuous"/>
+          <w:pgNumType w:fmt="lowerRoman" w:start="3"/>
+          <w:pgSz w:h="15840" w:w="12240"/>
+          <w:pgMar w:top="1587" w:right="1587" w:bottom="1587" w:left="2154" w:header="720" w:footer="720" w:gutter="0"/>
+        </w:sectPr>
+      </w:pPr>
       <w:r>
         <w:br w:type="page"/>
       </w:r>
     </w:p>
-    <w:bookmarkEnd w:id="25"/>
-    <w:bookmarkStart w:id="34" w:name="chapter-1-introduction"/>
+    <w:bookmarkEnd w:id="26"/>
+    <w:bookmarkStart w:id="35" w:name="chapter-1-introduction"/>
     <w:p>
       <w:pPr>
         <w:pStyle w:val="Heading1"/>
@@ -654,13 +802,13 @@
         <w:t xml:space="preserve">and should be reviewed by the supervisor before final report formatting.</w:t>
       </w:r>
     </w:p>
-    <w:bookmarkStart w:id="26" w:name="introduction-background"/>
+    <w:bookmarkStart w:id="27" w:name="introduction-background"/>
     <w:p>
       <w:pPr>
         <w:pStyle w:val="Heading2"/>
       </w:pPr>
       <w:r>
-        <w:t xml:space="preserve">1.1 1.1 Introduction / Background</w:t>
+        <w:t xml:space="preserve">1.1 Introduction / Background</w:t>
       </w:r>
     </w:p>
     <w:p>
@@ -775,14 +923,14 @@
         <w:t xml:space="preserve">.</w:t>
       </w:r>
     </w:p>
-    <w:bookmarkEnd w:id="26"/>
-    <w:bookmarkStart w:id="27" w:name="problem-statement"/>
+    <w:bookmarkEnd w:id="27"/>
+    <w:bookmarkStart w:id="28" w:name="problem-statement"/>
     <w:p>
       <w:pPr>
         <w:pStyle w:val="Heading2"/>
       </w:pPr>
       <w:r>
-        <w:t xml:space="preserve">1.2 1.2 Problem Statement</w:t>
+        <w:t xml:space="preserve">1.2 Problem Statement</w:t>
       </w:r>
     </w:p>
     <w:p>
@@ -857,14 +1005,14 @@
         <w:t xml:space="preserve">Therefore, the problem addressed in this project is the need for a structured machine learning-based software system that can separate mixed cardiopulmonary audio into heart and lung sound outputs, while remaining feasible for an FYP prototype. The system should support audio preprocessing, model-based separation, output generation, and evaluation using suitable signal-level metrics, without making unsupported clinical or diagnostic claims.</w:t>
       </w:r>
     </w:p>
-    <w:bookmarkEnd w:id="27"/>
-    <w:bookmarkStart w:id="28" w:name="project-aim"/>
+    <w:bookmarkEnd w:id="28"/>
+    <w:bookmarkStart w:id="29" w:name="project-aim"/>
     <w:p>
       <w:pPr>
         <w:pStyle w:val="Heading2"/>
       </w:pPr>
       <w:r>
-        <w:t xml:space="preserve">1.3 1.3 Project Aim</w:t>
+        <w:t xml:space="preserve">1.3 Project Aim</w:t>
       </w:r>
     </w:p>
     <w:p>
@@ -875,14 +1023,14 @@
         <w:t xml:space="preserve">The aim of this project is to design and develop a machine learning-based software prototype for cardiopulmonary sound separation that can process mixed chest sound recordings and produce separated heart sound and lung sound outputs.</w:t>
       </w:r>
     </w:p>
-    <w:bookmarkEnd w:id="28"/>
-    <w:bookmarkStart w:id="29" w:name="project-objectives"/>
+    <w:bookmarkEnd w:id="29"/>
+    <w:bookmarkStart w:id="30" w:name="project-objectives"/>
     <w:p>
       <w:pPr>
         <w:pStyle w:val="Heading2"/>
       </w:pPr>
       <w:r>
-        <w:t xml:space="preserve">1.4 1.4 Project Objectives</w:t>
+        <w:t xml:space="preserve">1.4 Project Objectives</w:t>
       </w:r>
     </w:p>
     <w:p>
@@ -953,14 +1101,14 @@
         <w:t xml:space="preserve">To evaluate the separated outputs using appropriate signal-level or separation-related metrics.</w:t>
       </w:r>
     </w:p>
-    <w:bookmarkEnd w:id="29"/>
-    <w:bookmarkStart w:id="30" w:name="project-scope"/>
+    <w:bookmarkEnd w:id="30"/>
+    <w:bookmarkStart w:id="31" w:name="project-scope"/>
     <w:p>
       <w:pPr>
         <w:pStyle w:val="Heading2"/>
       </w:pPr>
       <w:r>
-        <w:t xml:space="preserve">1.5 1.5 Project Scope</w:t>
+        <w:t xml:space="preserve">1.5 Project Scope</w:t>
       </w:r>
     </w:p>
     <w:p>
@@ -1139,14 +1287,14 @@
         <w:t xml:space="preserve">The main constraints are the two-trimester FYP timeframe, dependence on publicly available or accessible datasets, and the performance limitations of the selected machine learning method. Since dataset availability strongly affects evaluation, the project will avoid overclaiming generalizability beyond the data used for testing.</w:t>
       </w:r>
     </w:p>
-    <w:bookmarkEnd w:id="30"/>
-    <w:bookmarkStart w:id="31" w:name="project-significance"/>
+    <w:bookmarkEnd w:id="31"/>
+    <w:bookmarkStart w:id="32" w:name="project-significance"/>
     <w:p>
       <w:pPr>
         <w:pStyle w:val="Heading2"/>
       </w:pPr>
       <w:r>
-        <w:t xml:space="preserve">1.6 1.6 Project Significance</w:t>
+        <w:t xml:space="preserve">1.6 Project Significance</w:t>
       </w:r>
     </w:p>
     <w:p>
@@ -1221,14 +1369,14 @@
         <w:t xml:space="preserve">. The project does not claim to solve these challenges completely. Its contribution is to build a feasible student-level system that demonstrates a complete separation workflow and provides a foundation for future improvement.</w:t>
       </w:r>
     </w:p>
-    <w:bookmarkEnd w:id="31"/>
-    <w:bookmarkStart w:id="32" w:name="expected-output"/>
+    <w:bookmarkEnd w:id="32"/>
+    <w:bookmarkStart w:id="33" w:name="expected-output"/>
     <w:p>
       <w:pPr>
         <w:pStyle w:val="Heading2"/>
       </w:pPr>
       <w:r>
-        <w:t xml:space="preserve">1.7 1.7 Expected Output</w:t>
+        <w:t xml:space="preserve">1.7 Expected Output</w:t>
       </w:r>
     </w:p>
     <w:p>
@@ -1319,14 +1467,14 @@
         <w:t xml:space="preserve">The final output is intended to be a proof of concept. It should demonstrate the feasibility of the proposed software workflow, but it should not be presented as a clinically approved diagnostic system.</w:t>
       </w:r>
     </w:p>
-    <w:bookmarkEnd w:id="32"/>
-    <w:bookmarkStart w:id="33" w:name="report-organization"/>
+    <w:bookmarkEnd w:id="33"/>
+    <w:bookmarkStart w:id="34" w:name="report-organization"/>
     <w:p>
       <w:pPr>
         <w:pStyle w:val="Heading2"/>
       </w:pPr>
       <w:r>
-        <w:t xml:space="preserve">1.8 1.8 Report Organization</w:t>
+        <w:t xml:space="preserve">1.8 Report Organization</w:t>
       </w:r>
     </w:p>
     <w:p>
@@ -1385,9 +1533,14 @@
         <w:t xml:space="preserve">Chapter 6 will summarize the work completed during FYP1, discuss limitations and issues encountered, and outline the remaining work for the next phase of the project.</w:t>
       </w:r>
     </w:p>
-    <w:bookmarkEnd w:id="33"/>
+    <w:p>
+      <w:r>
+        <w:br w:type="page"/>
+      </w:r>
+    </w:p>
     <w:bookmarkEnd w:id="34"/>
-    <w:bookmarkStart w:id="45" w:name="chapter-2-literature-review"/>
+    <w:bookmarkEnd w:id="35"/>
+    <w:bookmarkStart w:id="51" w:name="chapter-2-literature-review"/>
     <w:p>
       <w:pPr>
         <w:pStyle w:val="Heading1"/>
@@ -1428,13 +1581,13 @@
         <w:t xml:space="preserve">, with emphasis on audio separation, preprocessing, datasets, evaluation, and prototype relevance rather than medical diagnosis.</w:t>
       </w:r>
     </w:p>
-    <w:bookmarkStart w:id="35" w:name="introduction"/>
+    <w:bookmarkStart w:id="36" w:name="introduction"/>
     <w:p>
       <w:pPr>
         <w:pStyle w:val="Heading2"/>
       </w:pPr>
       <w:r>
-        <w:t xml:space="preserve">2.1 2.1 Introduction</w:t>
+        <w:t xml:space="preserve">2.1 Introduction</w:t>
       </w:r>
     </w:p>
     <w:p>
@@ -1619,14 +1772,14 @@
         <w:t xml:space="preserve">.</w:t>
       </w:r>
     </w:p>
-    <w:bookmarkEnd w:id="35"/>
-    <w:bookmarkStart w:id="36" w:name="cardiopulmonary-sound-characteristics"/>
+    <w:bookmarkEnd w:id="36"/>
+    <w:bookmarkStart w:id="41" w:name="literature-search-and-screening-process"/>
     <w:p>
       <w:pPr>
         <w:pStyle w:val="Heading2"/>
       </w:pPr>
       <w:r>
-        <w:t xml:space="preserve">2.2 2.2 Cardiopulmonary Sound Characteristics</w:t>
+        <w:t xml:space="preserve">2.2 Literature Search and Screening Process</w:t>
       </w:r>
     </w:p>
     <w:p>
@@ -1634,6 +1787,115 @@
         <w:pStyle w:val="FirstParagraph"/>
       </w:pPr>
       <w:r>
+        <w:t xml:space="preserve">The literature review records were maintained through the project tracking files in the literature-review workflow. The current PRISMA summary reflects the latest recorded screening state: 96 records were retained in</w:t>
+      </w:r>
+      <w:r>
+        <w:t xml:space="preserve"> </w:t>
+      </w:r>
+      <w:r>
+        <w:rPr>
+          <w:rStyle w:val="VerbatimChar"/>
+        </w:rPr>
+        <w:t xml:space="preserve">papers_master.csv</w:t>
+      </w:r>
+      <w:r>
+        <w:t xml:space="preserve">, 18 studies were marked as included for the literature review, 31 records were retained as maybe/background evidence, and 47 records were excluded for reasons such as weak scope alignment, duplicate status, year-range exclusion, or access limitations. The PRISMA flow diagram summarizes this identification, screening, and final selection process.</w:t>
+      </w:r>
+    </w:p>
+    <w:tbl>
+      <w:tblPr>
+        <w:tblStyle w:val="Table"/>
+        <w:tblW w:type="pct" w:w="5000"/>
+        <w:tblLayout w:type="fixed"/>
+        <w:tblLook w:firstRow="0" w:lastRow="0" w:firstColumn="0" w:lastColumn="0" w:noHBand="0" w:noVBand="0" w:val="0000"/>
+      </w:tblPr>
+      <w:tblGrid>
+        <w:gridCol w:w="7920"/>
+      </w:tblGrid>
+      <w:tr>
+        <w:tc>
+          <w:tcPr/>
+          <w:bookmarkStart w:id="40" w:name="fig-prisma-flow"/>
+          <w:p>
+            <w:pPr>
+              <w:pStyle w:val="Compact"/>
+              <w:jc w:val="center"/>
+            </w:pPr>
+            <w:r>
+              <w:drawing>
+                <wp:inline>
+                  <wp:extent cx="5384800" cy="3808914"/>
+                  <wp:effectExtent b="0" l="0" r="0" t="0"/>
+                  <wp:docPr descr="" title="" id="38" name="Picture"/>
+                  <a:graphic>
+                    <a:graphicData uri="http://schemas.openxmlformats.org/drawingml/2006/picture">
+                      <pic:pic>
+                        <pic:nvPicPr>
+                          <pic:cNvPr descr="figures/prisma/prisma_flow_diagram.png" id="39" name="Picture"/>
+                          <pic:cNvPicPr>
+                            <a:picLocks noChangeArrowheads="1" noChangeAspect="1"/>
+                          </pic:cNvPicPr>
+                        </pic:nvPicPr>
+                        <pic:blipFill>
+                          <a:blip r:embed="rId37"/>
+                          <a:stretch>
+                            <a:fillRect/>
+                          </a:stretch>
+                        </pic:blipFill>
+                        <pic:spPr bwMode="auto">
+                          <a:xfrm>
+                            <a:off x="0" y="0"/>
+                            <a:ext cx="5384800" cy="3808914"/>
+                          </a:xfrm>
+                          <a:prstGeom prst="rect">
+                            <a:avLst/>
+                          </a:prstGeom>
+                          <a:noFill/>
+                          <a:ln w="9525">
+                            <a:noFill/>
+                            <a:headEnd/>
+                            <a:tailEnd/>
+                          </a:ln>
+                        </pic:spPr>
+                      </pic:pic>
+                    </a:graphicData>
+                  </a:graphic>
+                </wp:inline>
+              </w:drawing>
+            </w:r>
+          </w:p>
+          <w:p>
+            <w:pPr>
+              <w:jc w:val="center"/>
+            </w:pPr>
+            <w:pPr>
+              <w:jc w:val="left"/>
+              <w:spacing w:before="200"/>
+              <w:pStyle w:val="ImageCaption"/>
+            </w:pPr>
+            <w:r>
+              <w:t xml:space="preserve">Figure 2.1: PRISMA flow diagram for the literature search and screening process.</w:t>
+            </w:r>
+          </w:p>
+          <w:bookmarkEnd w:id="40"/>
+        </w:tc>
+      </w:tr>
+    </w:tbl>
+    <w:bookmarkEnd w:id="41"/>
+    <w:bookmarkStart w:id="42" w:name="cardiopulmonary-sound-characteristics"/>
+    <w:p>
+      <w:pPr>
+        <w:pStyle w:val="Heading2"/>
+      </w:pPr>
+      <w:r>
+        <w:t xml:space="preserve">2.3 Cardiopulmonary Sound Characteristics</w:t>
+      </w:r>
+    </w:p>
+    <w:p>
+      <w:pPr>
+        <w:pStyle w:val="FirstParagraph"/>
+      </w:pPr>
+      <w:r>
         <w:t xml:space="preserve">Heart and lung sounds differ in their physiological origin and acoustic pattern, but they are not cleanly separated in practical chest recordings. Heart sounds are commonly described using phonocardiogram (PCG) concepts such as S1, S2, cycles, envelopes, onset/offset timing, and time-frequency representations. Lung sounds are linked to respiratory airflow and breathing phase, and may contain continuous or discontinuous events depending on the recording context. Reviews of PCG signal analysis emphasize that preprocessing, segmentation, feature extraction, and noise handling are necessary before reliable higher-level analysis can be attempted</w:t>
       </w:r>
       <w:r>
@@ -1845,14 +2107,14 @@
         <w:t xml:space="preserve">. Therefore, a cardiopulmonary sound separation system should be designed as an audio-processing workflow with input checking, preprocessing, separation, and output inspection, rather than as a direct clinical decision system.</w:t>
       </w:r>
     </w:p>
-    <w:bookmarkEnd w:id="36"/>
-    <w:bookmarkStart w:id="37" w:name="heart-and-lung-sound-separation-problem"/>
+    <w:bookmarkEnd w:id="42"/>
+    <w:bookmarkStart w:id="43" w:name="heart-and-lung-sound-separation-problem"/>
     <w:p>
       <w:pPr>
         <w:pStyle w:val="Heading2"/>
       </w:pPr>
       <w:r>
-        <w:t xml:space="preserve">2.3 2.3 Heart and Lung Sound Separation Problem</w:t>
+        <w:t xml:space="preserve">2.4 Heart and Lung Sound Separation Problem</w:t>
       </w:r>
     </w:p>
     <w:p>
@@ -2077,14 +2339,14 @@
         <w:t xml:space="preserve">. These papers are relevant because they show that separation can improve or support later audio analysis, but they should not shift the project aim toward diagnosis. This FYP remains focused on separating and presenting heart and lung sound components.</w:t>
       </w:r>
     </w:p>
-    <w:bookmarkEnd w:id="37"/>
-    <w:bookmarkStart w:id="38" w:name="traditional-signal-processing-methods"/>
+    <w:bookmarkEnd w:id="43"/>
+    <w:bookmarkStart w:id="44" w:name="traditional-signal-processing-methods"/>
     <w:p>
       <w:pPr>
         <w:pStyle w:val="Heading2"/>
       </w:pPr>
       <w:r>
-        <w:t xml:space="preserve">2.4 2.4 Traditional Signal Processing Methods</w:t>
+        <w:t xml:space="preserve">2.5 Traditional Signal Processing Methods</w:t>
       </w:r>
     </w:p>
     <w:p>
@@ -2321,14 +2583,14 @@
         <w:t xml:space="preserve">Overall, traditional methods are valuable for FYP1 because they are easier to explain, can act as baselines, and clarify the assumptions behind separation. Their limitations are also clear: they can be sensitive to noise, parameter tuning, and dataset conditions. Therefore, they are best treated as baselines or components in a broader pipeline rather than as the only solution direction.</w:t>
       </w:r>
     </w:p>
-    <w:bookmarkEnd w:id="38"/>
-    <w:bookmarkStart w:id="39" w:name="Xa7cc223bb5fd8cb26f88550c6c83a706157f57c"/>
+    <w:bookmarkEnd w:id="44"/>
+    <w:bookmarkStart w:id="45" w:name="Xa7cc223bb5fd8cb26f88550c6c83a706157f57c"/>
     <w:p>
       <w:pPr>
         <w:pStyle w:val="Heading2"/>
       </w:pPr>
       <w:r>
-        <w:t xml:space="preserve">2.5 2.5 Machine Learning and Deep Learning Methods</w:t>
+        <w:t xml:space="preserve">2.6 Machine Learning and Deep Learning Methods</w:t>
       </w:r>
     </w:p>
     <w:p>
@@ -2581,14 +2843,14 @@
         <w:t xml:space="preserve">The comparison across methods suggests a practical design choice. A feasible FYP implementation should not simply choose the most complex recent model. It should select a method that can be implemented, explained, tested on available data, and integrated into a working software pipeline. In this sense, direct separation models such as NeoSSNet, hybrid methods such as DAE-NMF-VMD or NMF-plus-deep-learning models, and simpler supervised separation networks provide more practical guidance than diagnosis-only or highly specialized architectures.</w:t>
       </w:r>
     </w:p>
-    <w:bookmarkEnd w:id="39"/>
-    <w:bookmarkStart w:id="40" w:name="X08e818fb8b4894080955aaec5df4083f38724da"/>
+    <w:bookmarkEnd w:id="45"/>
+    <w:bookmarkStart w:id="46" w:name="X08e818fb8b4894080955aaec5df4083f38724da"/>
     <w:p>
       <w:pPr>
         <w:pStyle w:val="Heading2"/>
       </w:pPr>
       <w:r>
-        <w:t xml:space="preserve">2.6 2.6 Datasets for Cardiopulmonary Sound Separation</w:t>
+        <w:t xml:space="preserve">2.7 Datasets for Cardiopulmonary Sound Separation</w:t>
       </w:r>
     </w:p>
     <w:p>
@@ -2737,14 +2999,14 @@
         <w:t xml:space="preserve">This distinction leads to a clear dataset strategy for the FYP. HLS-CMDS should be treated as the primary separation-relevant dataset candidate because it includes mixed and source signals. PCG and respiratory datasets should be used only as background, preprocessing, or auxiliary evaluation context unless they can be adapted without changing the project objective. The chapter should keep this distinction explicit so the report does not blur source separation with disease classification.</w:t>
       </w:r>
     </w:p>
-    <w:bookmarkEnd w:id="40"/>
-    <w:bookmarkStart w:id="41" w:name="evaluation-metrics"/>
+    <w:bookmarkEnd w:id="46"/>
+    <w:bookmarkStart w:id="47" w:name="evaluation-metrics"/>
     <w:p>
       <w:pPr>
         <w:pStyle w:val="Heading2"/>
       </w:pPr>
       <w:r>
-        <w:t xml:space="preserve">2.7 2.7 Evaluation Metrics</w:t>
+        <w:t xml:space="preserve">2.8 Evaluation Metrics</w:t>
       </w:r>
     </w:p>
     <w:p>
@@ -2989,14 +3251,14 @@
         <w:t xml:space="preserve">. For this project, classification accuracy can be mentioned as background only. It should not be used as the main claim of success unless the methodology explicitly includes a justified downstream task.</w:t>
       </w:r>
     </w:p>
-    <w:bookmarkEnd w:id="41"/>
-    <w:bookmarkStart w:id="42" w:name="existing-systems-and-prototype-relevance"/>
+    <w:bookmarkEnd w:id="47"/>
+    <w:bookmarkStart w:id="48" w:name="existing-systems-and-prototype-relevance"/>
     <w:p>
       <w:pPr>
         <w:pStyle w:val="Heading2"/>
       </w:pPr>
       <w:r>
-        <w:t xml:space="preserve">2.8 2.8 Existing Systems and Prototype Relevance</w:t>
+        <w:t xml:space="preserve">2.9 Existing Systems and Prototype Relevance</w:t>
       </w:r>
     </w:p>
     <w:p>
@@ -3131,14 +3393,14 @@
         <w:t xml:space="preserve">For this FYP, the literature supports a modular system design. A realistic prototype should allow a user to upload or select an audio file, preprocess the waveform, apply a separation method, save separated heart and lung outputs, compute available signal-quality or separation metrics, and present the results through an interface. The prototype does not need to reproduce a full clinical auscultation platform. Its contribution should be a clear, reproducible, and explainable pipeline for cardiopulmonary sound separation.</w:t>
       </w:r>
     </w:p>
-    <w:bookmarkEnd w:id="42"/>
-    <w:bookmarkStart w:id="43" w:name="research-gaps"/>
+    <w:bookmarkEnd w:id="48"/>
+    <w:bookmarkStart w:id="49" w:name="research-gaps"/>
     <w:p>
       <w:pPr>
         <w:pStyle w:val="Heading2"/>
       </w:pPr>
       <w:r>
-        <w:t xml:space="preserve">2.9 2.9 Research Gaps</w:t>
+        <w:t xml:space="preserve">2.10 Research Gaps</w:t>
       </w:r>
     </w:p>
     <w:p>
@@ -3559,14 +3821,14 @@
         <w:t xml:space="preserve">Therefore, the research gap for this FYP can be stated as follows: recent literature provides promising methods and datasets for heart-lung or cardiopulmonary sound separation, but there remains a need for a clear, reproducible, student-feasible software system that applies an appropriate ML-based separation workflow, uses separation-relevant data where available, reports suitable signal-level evaluation, and avoids unsupported diagnostic claims.</w:t>
       </w:r>
     </w:p>
-    <w:bookmarkEnd w:id="43"/>
-    <w:bookmarkStart w:id="44" w:name="summary"/>
+    <w:bookmarkEnd w:id="49"/>
+    <w:bookmarkStart w:id="50" w:name="summary"/>
     <w:p>
       <w:pPr>
         <w:pStyle w:val="Heading2"/>
       </w:pPr>
       <w:r>
-        <w:t xml:space="preserve">2.10 2.10 Summary</w:t>
+        <w:t xml:space="preserve">2.11 Summary</w:t>
       </w:r>
     </w:p>
     <w:p>
@@ -3807,9 +4069,14 @@
         <w:t xml:space="preserve">Overall, the reviewed evidence supports a practical FYP system that preprocesses cardiopulmonary audio, separates heart and lung components using a feasible ML-based method, stores the separated outputs, and reports suitable evaluation information. The next chapter should translate this review into a methodology by selecting the data source, defining the processing pipeline, choosing the separation model, and specifying the evaluation procedure for the prototype.</w:t>
       </w:r>
     </w:p>
-    <w:bookmarkEnd w:id="44"/>
-    <w:bookmarkEnd w:id="45"/>
-    <w:bookmarkStart w:id="58" w:name="chapter-3-methodology"/>
+    <w:p>
+      <w:r>
+        <w:br w:type="page"/>
+      </w:r>
+    </w:p>
+    <w:bookmarkEnd w:id="50"/>
+    <w:bookmarkEnd w:id="51"/>
+    <w:bookmarkStart w:id="64" w:name="chapter-3-methodology"/>
     <w:p>
       <w:pPr>
         <w:pStyle w:val="Heading1"/>
@@ -3841,13 +4108,13 @@
         <w:t xml:space="preserve">and describes a software prototype/proof-of-concept methodology. The final technical details should be updated after the prototype implementation is confirmed.</w:t>
       </w:r>
     </w:p>
-    <w:bookmarkStart w:id="46" w:name="introduction-1"/>
+    <w:bookmarkStart w:id="52" w:name="introduction-1"/>
     <w:p>
       <w:pPr>
         <w:pStyle w:val="Heading2"/>
       </w:pPr>
       <w:r>
-        <w:t xml:space="preserve">3.1 3.1 Introduction</w:t>
+        <w:t xml:space="preserve">3.1 Introduction</w:t>
       </w:r>
     </w:p>
     <w:p>
@@ -3874,14 +4141,14 @@
         <w:t xml:space="preserve">The literature review in Chapter 2 shows that cardiopulmonary sound separation can be approached using traditional signal processing, hybrid signal-processing and machine-learning methods, and deep learning models. It also shows that dataset selection and evaluation are major issues because not all heart sound or lung sound datasets provide paired mixed and source signals. Therefore, this methodology emphasizes a reproducible software workflow, careful dataset selection, preprocessing, model-based separation, and signal-level evaluation.</w:t>
       </w:r>
     </w:p>
-    <w:bookmarkEnd w:id="46"/>
-    <w:bookmarkStart w:id="47" w:name="research-development-approach"/>
+    <w:bookmarkEnd w:id="52"/>
+    <w:bookmarkStart w:id="53" w:name="research-development-approach"/>
     <w:p>
       <w:pPr>
         <w:pStyle w:val="Heading2"/>
       </w:pPr>
       <w:r>
-        <w:t xml:space="preserve">3.2 3.2 Research / Development Approach</w:t>
+        <w:t xml:space="preserve">3.2 Research / Development Approach</w:t>
       </w:r>
     </w:p>
     <w:p>
@@ -4092,14 +4359,14 @@
         <w:t xml:space="preserve">Document the results, limitations, and future improvements.</w:t>
       </w:r>
     </w:p>
-    <w:bookmarkEnd w:id="47"/>
-    <w:bookmarkStart w:id="48" w:name="system-development-methodology"/>
+    <w:bookmarkEnd w:id="53"/>
+    <w:bookmarkStart w:id="54" w:name="system-development-methodology"/>
     <w:p>
       <w:pPr>
         <w:pStyle w:val="Heading2"/>
       </w:pPr>
       <w:r>
-        <w:t xml:space="preserve">3.3 3.3 System Development Methodology</w:t>
+        <w:t xml:space="preserve">3.3 System Development Methodology</w:t>
       </w:r>
     </w:p>
     <w:p>
@@ -4422,14 +4689,14 @@
         <w:t xml:space="preserve">This approach supports the FYP1 requirement to demonstrate a clear development plan while leaving space for implementation refinement in the next phase.</w:t>
       </w:r>
     </w:p>
-    <w:bookmarkEnd w:id="48"/>
-    <w:bookmarkStart w:id="49" w:name="dataset-selection-and-preparation"/>
+    <w:bookmarkEnd w:id="54"/>
+    <w:bookmarkStart w:id="55" w:name="dataset-selection-and-preparation"/>
     <w:p>
       <w:pPr>
         <w:pStyle w:val="Heading2"/>
       </w:pPr>
       <w:r>
-        <w:t xml:space="preserve">3.4 3.4 Dataset Selection and Preparation</w:t>
+        <w:t xml:space="preserve">3.4 Dataset Selection and Preparation</w:t>
       </w:r>
     </w:p>
     <w:p>
@@ -4675,14 +4942,14 @@
         <w:t xml:space="preserve">Keeping notes on any excluded files, missing files, or unusable samples.</w:t>
       </w:r>
     </w:p>
-    <w:bookmarkEnd w:id="49"/>
-    <w:bookmarkStart w:id="50" w:name="audio-preprocessing"/>
+    <w:bookmarkEnd w:id="55"/>
+    <w:bookmarkStart w:id="56" w:name="audio-preprocessing"/>
     <w:p>
       <w:pPr>
         <w:pStyle w:val="Heading2"/>
       </w:pPr>
       <w:r>
-        <w:t xml:space="preserve">3.5 3.5 Audio Preprocessing</w:t>
+        <w:t xml:space="preserve">3.5 Audio Preprocessing</w:t>
       </w:r>
     </w:p>
     <w:p>
@@ -4839,14 +5106,14 @@
         <w:t xml:space="preserve">.</w:t>
       </w:r>
     </w:p>
-    <w:bookmarkEnd w:id="50"/>
-    <w:bookmarkStart w:id="51" w:name="feature-extraction-input-representation"/>
+    <w:bookmarkEnd w:id="56"/>
+    <w:bookmarkStart w:id="57" w:name="feature-extraction-input-representation"/>
     <w:p>
       <w:pPr>
         <w:pStyle w:val="Heading2"/>
       </w:pPr>
       <w:r>
-        <w:t xml:space="preserve">3.6 3.6 Feature Extraction / Input Representation</w:t>
+        <w:t xml:space="preserve">3.6 Feature Extraction / Input Representation</w:t>
       </w:r>
     </w:p>
     <w:p>
@@ -4901,14 +5168,14 @@
         <w:t xml:space="preserve">For the first prototype, the input representation should be selected based on feasibility and compatibility with the chosen model. A practical approach is to begin with short audio windows and a time-frequency representation, then reconstruct separated heart and lung waveform outputs after model inference. The final choice will be documented after implementation testing.</w:t>
       </w:r>
     </w:p>
-    <w:bookmarkEnd w:id="51"/>
-    <w:bookmarkStart w:id="52" w:name="machine-learning-model-approach"/>
+    <w:bookmarkEnd w:id="57"/>
+    <w:bookmarkStart w:id="58" w:name="machine-learning-model-approach"/>
     <w:p>
       <w:pPr>
         <w:pStyle w:val="Heading2"/>
       </w:pPr>
       <w:r>
-        <w:t xml:space="preserve">3.7 3.7 Machine Learning Model Approach</w:t>
+        <w:t xml:space="preserve">3.7 Machine Learning Model Approach</w:t>
       </w:r>
     </w:p>
     <w:p>
@@ -5161,14 +5428,14 @@
         <w:t xml:space="preserve">. The final method choice will be confirmed after dataset inspection and prototype testing.</w:t>
       </w:r>
     </w:p>
-    <w:bookmarkEnd w:id="52"/>
-    <w:bookmarkStart w:id="53" w:name="system-architecture-overview"/>
+    <w:bookmarkEnd w:id="58"/>
+    <w:bookmarkStart w:id="59" w:name="system-architecture-overview"/>
     <w:p>
       <w:pPr>
         <w:pStyle w:val="Heading2"/>
       </w:pPr>
       <w:r>
-        <w:t xml:space="preserve">3.8 3.8 System Architecture Overview</w:t>
+        <w:t xml:space="preserve">3.8 System Architecture Overview</w:t>
       </w:r>
     </w:p>
     <w:p>
@@ -5291,14 +5558,14 @@
         <w:t xml:space="preserve">This architecture supports the software-system focus of the project. It avoids treating the model as a standalone script and instead places the model inside a complete audio-processing workflow.</w:t>
       </w:r>
     </w:p>
-    <w:bookmarkEnd w:id="53"/>
-    <w:bookmarkStart w:id="54" w:name="system-modules"/>
+    <w:bookmarkEnd w:id="59"/>
+    <w:bookmarkStart w:id="60" w:name="system-modules"/>
     <w:p>
       <w:pPr>
         <w:pStyle w:val="Heading2"/>
       </w:pPr>
       <w:r>
-        <w:t xml:space="preserve">3.9 3.9 System Modules</w:t>
+        <w:t xml:space="preserve">3.9 System Modules</w:t>
       </w:r>
     </w:p>
     <w:p>
@@ -5818,14 +6085,14 @@
         <w:t xml:space="preserve">These modules may be implemented as Python scripts, backend services, or application components depending on the final prototype design.</w:t>
       </w:r>
     </w:p>
-    <w:bookmarkEnd w:id="54"/>
-    <w:bookmarkStart w:id="55" w:name="evaluation-methodology"/>
+    <w:bookmarkEnd w:id="60"/>
+    <w:bookmarkStart w:id="61" w:name="evaluation-methodology"/>
     <w:p>
       <w:pPr>
         <w:pStyle w:val="Heading2"/>
       </w:pPr>
       <w:r>
-        <w:t xml:space="preserve">3.10 3.10 Evaluation Methodology</w:t>
+        <w:t xml:space="preserve">3.10 Evaluation Methodology</w:t>
       </w:r>
     </w:p>
     <w:p>
@@ -5944,14 +6211,14 @@
         <w:t xml:space="preserve">The exact metrics will be finalized after confirming the dataset and model. Possible metric categories include signal-to-noise improvement, reconstruction error, correlation or similarity with reference sources, and source-separation quality measures. If reference source signals are not available for some data, the evaluation will be limited to qualitative inspection and indirect signal-quality measures. Classification accuracy will not be used as the main evaluation metric because the project objective is separation rather than disease detection.</w:t>
       </w:r>
     </w:p>
-    <w:bookmarkEnd w:id="55"/>
-    <w:bookmarkStart w:id="56" w:name="tools-and-technologies"/>
+    <w:bookmarkEnd w:id="61"/>
+    <w:bookmarkStart w:id="62" w:name="tools-and-technologies"/>
     <w:p>
       <w:pPr>
         <w:pStyle w:val="Heading2"/>
       </w:pPr>
       <w:r>
-        <w:t xml:space="preserve">3.11 3.11 Tools and Technologies</w:t>
+        <w:t xml:space="preserve">3.11 Tools and Technologies</w:t>
       </w:r>
     </w:p>
     <w:p>
@@ -6266,14 +6533,14 @@
         <w:t xml:space="preserve">The final toolset should be confirmed during implementation. Tools should be selected based on project feasibility, reproducibility, and compatibility with the selected dataset and model.</w:t>
       </w:r>
     </w:p>
-    <w:bookmarkEnd w:id="56"/>
-    <w:bookmarkStart w:id="57" w:name="chapter-summary"/>
+    <w:bookmarkEnd w:id="62"/>
+    <w:bookmarkStart w:id="63" w:name="chapter-summary"/>
     <w:p>
       <w:pPr>
         <w:pStyle w:val="Heading2"/>
       </w:pPr>
       <w:r>
-        <w:t xml:space="preserve">3.12 3.12 Chapter Summary</w:t>
+        <w:t xml:space="preserve">3.12 Chapter Summary</w:t>
       </w:r>
     </w:p>
     <w:p>
@@ -6292,9 +6559,14 @@
         <w:t xml:space="preserve">The methodology supports the proposal by focusing on a software system that separates mixed cardiopulmonary audio into heart and lung sound outputs. It also respects the project boundary by excluding disease detection, clinical diagnosis, and hardware development. The next chapter should develop the system design in more detail, including diagrams, module interactions, data flow, and interface design for the prototype.</w:t>
       </w:r>
     </w:p>
-    <w:bookmarkEnd w:id="57"/>
-    <w:bookmarkEnd w:id="58"/>
-    <w:bookmarkStart w:id="67" w:name="chapter-4-system-design"/>
+    <w:p>
+      <w:r>
+        <w:br w:type="page"/>
+      </w:r>
+    </w:p>
+    <w:bookmarkEnd w:id="63"/>
+    <w:bookmarkEnd w:id="64"/>
+    <w:bookmarkStart w:id="73" w:name="chapter-4-system-design"/>
     <w:p>
       <w:pPr>
         <w:pStyle w:val="Heading1"/>
@@ -6303,7 +6575,7 @@
         <w:t xml:space="preserve">4. Chapter 4: System Design</w:t>
       </w:r>
     </w:p>
-    <w:bookmarkStart w:id="59" w:name="overview"/>
+    <w:bookmarkStart w:id="65" w:name="overview"/>
     <w:p>
       <w:pPr>
         <w:pStyle w:val="Heading2"/>
@@ -6320,8 +6592,8 @@
         <w:t xml:space="preserve">Placeholder content for system design.</w:t>
       </w:r>
     </w:p>
-    <w:bookmarkEnd w:id="59"/>
-    <w:bookmarkStart w:id="60" w:name="context-diagram"/>
+    <w:bookmarkEnd w:id="65"/>
+    <w:bookmarkStart w:id="66" w:name="context-diagram"/>
     <w:p>
       <w:pPr>
         <w:pStyle w:val="Heading2"/>
@@ -6338,8 +6610,8 @@
         <w:t xml:space="preserve">Placeholder context diagram notes.</w:t>
       </w:r>
     </w:p>
-    <w:bookmarkEnd w:id="60"/>
-    <w:bookmarkStart w:id="61" w:name="use-case-diagram"/>
+    <w:bookmarkEnd w:id="66"/>
+    <w:bookmarkStart w:id="67" w:name="use-case-diagram"/>
     <w:p>
       <w:pPr>
         <w:pStyle w:val="Heading2"/>
@@ -6356,8 +6628,8 @@
         <w:t xml:space="preserve">Placeholder use case diagram notes.</w:t>
       </w:r>
     </w:p>
-    <w:bookmarkEnd w:id="61"/>
-    <w:bookmarkStart w:id="62" w:name="activity-diagram"/>
+    <w:bookmarkEnd w:id="67"/>
+    <w:bookmarkStart w:id="68" w:name="activity-diagram"/>
     <w:p>
       <w:pPr>
         <w:pStyle w:val="Heading2"/>
@@ -6374,8 +6646,8 @@
         <w:t xml:space="preserve">Placeholder activity diagram notes.</w:t>
       </w:r>
     </w:p>
-    <w:bookmarkEnd w:id="62"/>
-    <w:bookmarkStart w:id="63" w:name="class-diagram"/>
+    <w:bookmarkEnd w:id="68"/>
+    <w:bookmarkStart w:id="69" w:name="class-diagram"/>
     <w:p>
       <w:pPr>
         <w:pStyle w:val="Heading2"/>
@@ -6392,8 +6664,8 @@
         <w:t xml:space="preserve">Placeholder class diagram notes.</w:t>
       </w:r>
     </w:p>
-    <w:bookmarkEnd w:id="63"/>
-    <w:bookmarkStart w:id="64" w:name="sequence-diagram"/>
+    <w:bookmarkEnd w:id="69"/>
+    <w:bookmarkStart w:id="70" w:name="sequence-diagram"/>
     <w:p>
       <w:pPr>
         <w:pStyle w:val="Heading2"/>
@@ -6410,8 +6682,8 @@
         <w:t xml:space="preserve">Placeholder sequence diagram notes.</w:t>
       </w:r>
     </w:p>
-    <w:bookmarkEnd w:id="64"/>
-    <w:bookmarkStart w:id="65" w:name="interface-design"/>
+    <w:bookmarkEnd w:id="70"/>
+    <w:bookmarkStart w:id="71" w:name="interface-design"/>
     <w:p>
       <w:pPr>
         <w:pStyle w:val="Heading2"/>
@@ -6428,8 +6700,8 @@
         <w:t xml:space="preserve">Placeholder interface design notes.</w:t>
       </w:r>
     </w:p>
-    <w:bookmarkEnd w:id="65"/>
-    <w:bookmarkStart w:id="66" w:name="summary-1"/>
+    <w:bookmarkEnd w:id="71"/>
+    <w:bookmarkStart w:id="72" w:name="summary-1"/>
     <w:p>
       <w:pPr>
         <w:pStyle w:val="Heading2"/>
@@ -6446,9 +6718,14 @@
         <w:t xml:space="preserve">Placeholder system design summary.</w:t>
       </w:r>
     </w:p>
-    <w:bookmarkEnd w:id="66"/>
-    <w:bookmarkEnd w:id="67"/>
-    <w:bookmarkStart w:id="71" w:name="chapter-5-implementation-plan"/>
+    <w:p>
+      <w:r>
+        <w:br w:type="page"/>
+      </w:r>
+    </w:p>
+    <w:bookmarkEnd w:id="72"/>
+    <w:bookmarkEnd w:id="73"/>
+    <w:bookmarkStart w:id="77" w:name="chapter-5-implementation-plan"/>
     <w:p>
       <w:pPr>
         <w:pStyle w:val="Heading1"/>
@@ -6457,7 +6734,7 @@
         <w:t xml:space="preserve">5. Chapter 5: Implementation Plan</w:t>
       </w:r>
     </w:p>
-    <w:bookmarkStart w:id="68" w:name="development-phase"/>
+    <w:bookmarkStart w:id="74" w:name="development-phase"/>
     <w:p>
       <w:pPr>
         <w:pStyle w:val="Heading2"/>
@@ -6474,8 +6751,8 @@
         <w:t xml:space="preserve">Placeholder development phase.</w:t>
       </w:r>
     </w:p>
-    <w:bookmarkEnd w:id="68"/>
-    <w:bookmarkStart w:id="69" w:name="testing-phase"/>
+    <w:bookmarkEnd w:id="74"/>
+    <w:bookmarkStart w:id="75" w:name="testing-phase"/>
     <w:p>
       <w:pPr>
         <w:pStyle w:val="Heading2"/>
@@ -6492,8 +6769,8 @@
         <w:t xml:space="preserve">Placeholder testing phase.</w:t>
       </w:r>
     </w:p>
-    <w:bookmarkEnd w:id="69"/>
-    <w:bookmarkStart w:id="70" w:name="deployment-phase"/>
+    <w:bookmarkEnd w:id="75"/>
+    <w:bookmarkStart w:id="76" w:name="deployment-phase"/>
     <w:p>
       <w:pPr>
         <w:pStyle w:val="Heading2"/>
@@ -6510,9 +6787,14 @@
         <w:t xml:space="preserve">Placeholder deployment phase, if applicable.</w:t>
       </w:r>
     </w:p>
-    <w:bookmarkEnd w:id="70"/>
-    <w:bookmarkEnd w:id="71"/>
-    <w:bookmarkStart w:id="72" w:name="chapter-6-conclusion"/>
+    <w:p>
+      <w:r>
+        <w:br w:type="page"/>
+      </w:r>
+    </w:p>
+    <w:bookmarkEnd w:id="76"/>
+    <w:bookmarkEnd w:id="77"/>
+    <w:bookmarkStart w:id="78" w:name="chapter-6-conclusion"/>
     <w:p>
       <w:pPr>
         <w:pStyle w:val="Heading1"/>
@@ -6529,8 +6811,13 @@
         <w:t xml:space="preserve">Placeholder conclusion for FYP1 progress and next-phase work.</w:t>
       </w:r>
     </w:p>
-    <w:bookmarkEnd w:id="72"/>
-    <w:bookmarkStart w:id="144" w:name="references"/>
+    <w:p>
+      <w:r>
+        <w:br w:type="page"/>
+      </w:r>
+    </w:p>
+    <w:bookmarkEnd w:id="78"/>
+    <w:bookmarkStart w:id="150" w:name="references"/>
     <w:p>
       <w:pPr>
         <w:pStyle w:val="Heading1"/>
@@ -6539,8 +6826,8 @@
         <w:t xml:space="preserve">References</w:t>
       </w:r>
     </w:p>
-    <w:bookmarkStart w:id="143" w:name="refs"/>
-    <w:bookmarkStart w:id="74" w:name="ref-ali2023lunet"/>
+    <w:bookmarkStart w:id="149" w:name="refs"/>
+    <w:bookmarkStart w:id="80" w:name="ref-ali2023lunet"/>
     <w:p>
       <w:pPr>
         <w:pStyle w:val="Bibliography"/>
@@ -6564,7 +6851,7 @@
       <w:r>
         <w:t xml:space="preserve"> </w:t>
       </w:r>
-      <w:hyperlink r:id="rId73">
+      <w:hyperlink r:id="rId79">
         <w:r>
           <w:rPr>
             <w:rStyle w:val="Hyperlink"/>
@@ -6576,8 +6863,8 @@
         <w:t xml:space="preserve">.</w:t>
       </w:r>
     </w:p>
-    <w:bookmarkEnd w:id="74"/>
-    <w:bookmarkStart w:id="76" w:name="ref-ali2026buet2"/>
+    <w:bookmarkEnd w:id="80"/>
+    <w:bookmarkStart w:id="82" w:name="ref-ali2026buet2"/>
     <w:p>
       <w:pPr>
         <w:pStyle w:val="Bibliography"/>
@@ -6601,7 +6888,7 @@
       <w:r>
         <w:t xml:space="preserve"> </w:t>
       </w:r>
-      <w:hyperlink r:id="rId75">
+      <w:hyperlink r:id="rId81">
         <w:r>
           <w:rPr>
             <w:rStyle w:val="Hyperlink"/>
@@ -6613,8 +6900,8 @@
         <w:t xml:space="preserve">.</w:t>
       </w:r>
     </w:p>
-    <w:bookmarkEnd w:id="76"/>
-    <w:bookmarkStart w:id="78" w:name="ref-arjoune2023stethaid"/>
+    <w:bookmarkEnd w:id="82"/>
+    <w:bookmarkStart w:id="84" w:name="ref-arjoune2023stethaid"/>
     <w:p>
       <w:pPr>
         <w:pStyle w:val="Bibliography"/>
@@ -6638,7 +6925,7 @@
       <w:r>
         <w:t xml:space="preserve"> </w:t>
       </w:r>
-      <w:hyperlink r:id="rId77">
+      <w:hyperlink r:id="rId83">
         <w:r>
           <w:rPr>
             <w:rStyle w:val="Hyperlink"/>
@@ -6650,8 +6937,8 @@
         <w:t xml:space="preserve">.</w:t>
       </w:r>
     </w:p>
-    <w:bookmarkEnd w:id="78"/>
-    <w:bookmarkStart w:id="80" w:name="ref-baeyens2025compressed"/>
+    <w:bookmarkEnd w:id="84"/>
+    <w:bookmarkStart w:id="86" w:name="ref-baeyens2025compressed"/>
     <w:p>
       <w:pPr>
         <w:pStyle w:val="Bibliography"/>
@@ -6675,7 +6962,7 @@
       <w:r>
         <w:t xml:space="preserve"> </w:t>
       </w:r>
-      <w:hyperlink r:id="rId79">
+      <w:hyperlink r:id="rId85">
         <w:r>
           <w:rPr>
             <w:rStyle w:val="Hyperlink"/>
@@ -6687,8 +6974,8 @@
         <w:t xml:space="preserve">.</w:t>
       </w:r>
     </w:p>
-    <w:bookmarkEnd w:id="80"/>
-    <w:bookmarkStart w:id="82" w:name="ref-behera2026adaptive"/>
+    <w:bookmarkEnd w:id="86"/>
+    <w:bookmarkStart w:id="88" w:name="ref-behera2026adaptive"/>
     <w:p>
       <w:pPr>
         <w:pStyle w:val="Bibliography"/>
@@ -6712,7 +6999,7 @@
       <w:r>
         <w:t xml:space="preserve"> </w:t>
       </w:r>
-      <w:hyperlink r:id="rId81">
+      <w:hyperlink r:id="rId87">
         <w:r>
           <w:rPr>
             <w:rStyle w:val="Hyperlink"/>
@@ -6724,8 +7011,8 @@
         <w:t xml:space="preserve">.</w:t>
       </w:r>
     </w:p>
-    <w:bookmarkEnd w:id="82"/>
-    <w:bookmarkStart w:id="84" w:name="ref-fattahi2022blind2"/>
+    <w:bookmarkEnd w:id="88"/>
+    <w:bookmarkStart w:id="90" w:name="ref-fattahi2022blind2"/>
     <w:p>
       <w:pPr>
         <w:pStyle w:val="Bibliography"/>
@@ -6749,7 +7036,7 @@
       <w:r>
         <w:t xml:space="preserve"> </w:t>
       </w:r>
-      <w:hyperlink r:id="rId83">
+      <w:hyperlink r:id="rId89">
         <w:r>
           <w:rPr>
             <w:rStyle w:val="Hyperlink"/>
@@ -6761,8 +7048,8 @@
         <w:t xml:space="preserve">.</w:t>
       </w:r>
     </w:p>
-    <w:bookmarkEnd w:id="84"/>
-    <w:bookmarkStart w:id="86" w:name="ref-grooby2022real"/>
+    <w:bookmarkEnd w:id="90"/>
+    <w:bookmarkStart w:id="92" w:name="ref-grooby2022real"/>
     <w:p>
       <w:pPr>
         <w:pStyle w:val="Bibliography"/>
@@ -6786,7 +7073,7 @@
       <w:r>
         <w:t xml:space="preserve"> </w:t>
       </w:r>
-      <w:hyperlink r:id="rId85">
+      <w:hyperlink r:id="rId91">
         <w:r>
           <w:rPr>
             <w:rStyle w:val="Hyperlink"/>
@@ -6798,8 +7085,8 @@
         <w:t xml:space="preserve">.</w:t>
       </w:r>
     </w:p>
-    <w:bookmarkEnd w:id="86"/>
-    <w:bookmarkStart w:id="88" w:name="ref-grooby2023noisyneonatal"/>
+    <w:bookmarkEnd w:id="92"/>
+    <w:bookmarkStart w:id="94" w:name="ref-grooby2023noisyneonatal"/>
     <w:p>
       <w:pPr>
         <w:pStyle w:val="Bibliography"/>
@@ -6823,7 +7110,7 @@
       <w:r>
         <w:t xml:space="preserve"> </w:t>
       </w:r>
-      <w:hyperlink r:id="rId87">
+      <w:hyperlink r:id="rId93">
         <w:r>
           <w:rPr>
             <w:rStyle w:val="Hyperlink"/>
@@ -6835,8 +7122,8 @@
         <w:t xml:space="preserve">.</w:t>
       </w:r>
     </w:p>
-    <w:bookmarkEnd w:id="88"/>
-    <w:bookmarkStart w:id="90" w:name="ref-han2025cardiorespiratory"/>
+    <w:bookmarkEnd w:id="94"/>
+    <w:bookmarkStart w:id="96" w:name="ref-han2025cardiorespiratory"/>
     <w:p>
       <w:pPr>
         <w:pStyle w:val="Bibliography"/>
@@ -6860,7 +7147,7 @@
       <w:r>
         <w:t xml:space="preserve"> </w:t>
       </w:r>
-      <w:hyperlink r:id="rId89">
+      <w:hyperlink r:id="rId95">
         <w:r>
           <w:rPr>
             <w:rStyle w:val="Hyperlink"/>
@@ -6872,8 +7159,8 @@
         <w:t xml:space="preserve">.</w:t>
       </w:r>
     </w:p>
-    <w:bookmarkEnd w:id="90"/>
-    <w:bookmarkStart w:id="92" w:name="ref-hoang2023reliable"/>
+    <w:bookmarkEnd w:id="96"/>
+    <w:bookmarkStart w:id="98" w:name="ref-hoang2023reliable"/>
     <w:p>
       <w:pPr>
         <w:pStyle w:val="Bibliography"/>
@@ -6897,7 +7184,7 @@
       <w:r>
         <w:t xml:space="preserve"> </w:t>
       </w:r>
-      <w:hyperlink r:id="rId91">
+      <w:hyperlink r:id="rId97">
         <w:r>
           <w:rPr>
             <w:rStyle w:val="Hyperlink"/>
@@ -6909,8 +7196,8 @@
         <w:t xml:space="preserve">.</w:t>
       </w:r>
     </w:p>
-    <w:bookmarkEnd w:id="92"/>
-    <w:bookmarkStart w:id="94" w:name="ref-jakubec2025robust"/>
+    <w:bookmarkEnd w:id="98"/>
+    <w:bookmarkStart w:id="100" w:name="ref-jakubec2025robust"/>
     <w:p>
       <w:pPr>
         <w:pStyle w:val="Bibliography"/>
@@ -6934,7 +7221,7 @@
       <w:r>
         <w:t xml:space="preserve"> </w:t>
       </w:r>
-      <w:hyperlink r:id="rId93">
+      <w:hyperlink r:id="rId99">
         <w:r>
           <w:rPr>
             <w:rStyle w:val="Hyperlink"/>
@@ -6946,8 +7233,8 @@
         <w:t xml:space="preserve">.</w:t>
       </w:r>
     </w:p>
-    <w:bookmarkEnd w:id="94"/>
-    <w:bookmarkStart w:id="96" w:name="ref-mutlu2024bridging"/>
+    <w:bookmarkEnd w:id="100"/>
+    <w:bookmarkStart w:id="102" w:name="ref-mutlu2024bridging"/>
     <w:p>
       <w:pPr>
         <w:pStyle w:val="Bibliography"/>
@@ -6971,7 +7258,7 @@
       <w:r>
         <w:t xml:space="preserve"> </w:t>
       </w:r>
-      <w:hyperlink r:id="rId95">
+      <w:hyperlink r:id="rId101">
         <w:r>
           <w:rPr>
             <w:rStyle w:val="Hyperlink"/>
@@ -6983,8 +7270,8 @@
         <w:t xml:space="preserve">.</w:t>
       </w:r>
     </w:p>
-    <w:bookmarkEnd w:id="96"/>
-    <w:bookmarkStart w:id="98" w:name="ref-pal2024automatic"/>
+    <w:bookmarkEnd w:id="102"/>
+    <w:bookmarkStart w:id="104" w:name="ref-pal2024automatic"/>
     <w:p>
       <w:pPr>
         <w:pStyle w:val="Bibliography"/>
@@ -7008,7 +7295,7 @@
       <w:r>
         <w:t xml:space="preserve"> </w:t>
       </w:r>
-      <w:hyperlink r:id="rId97">
+      <w:hyperlink r:id="rId103">
         <w:r>
           <w:rPr>
             <w:rStyle w:val="Hyperlink"/>
@@ -7020,8 +7307,8 @@
         <w:t xml:space="preserve">.</w:t>
       </w:r>
     </w:p>
-    <w:bookmarkEnd w:id="98"/>
-    <w:bookmarkStart w:id="100" w:name="ref-poh2026reprogramming2"/>
+    <w:bookmarkEnd w:id="104"/>
+    <w:bookmarkStart w:id="106" w:name="ref-poh2026reprogramming2"/>
     <w:p>
       <w:pPr>
         <w:pStyle w:val="Bibliography"/>
@@ -7045,7 +7332,7 @@
       <w:r>
         <w:t xml:space="preserve"> </w:t>
       </w:r>
-      <w:hyperlink r:id="rId99">
+      <w:hyperlink r:id="rId105">
         <w:r>
           <w:rPr>
             <w:rStyle w:val="Hyperlink"/>
@@ -7057,8 +7344,8 @@
         <w:t xml:space="preserve">.</w:t>
       </w:r>
     </w:p>
-    <w:bookmarkEnd w:id="100"/>
-    <w:bookmarkStart w:id="102" w:name="ref-poh2024neossnet"/>
+    <w:bookmarkEnd w:id="106"/>
+    <w:bookmarkStart w:id="108" w:name="ref-poh2024neossnet"/>
     <w:p>
       <w:pPr>
         <w:pStyle w:val="Bibliography"/>
@@ -7082,7 +7369,7 @@
       <w:r>
         <w:t xml:space="preserve"> </w:t>
       </w:r>
-      <w:hyperlink r:id="rId101">
+      <w:hyperlink r:id="rId107">
         <w:r>
           <w:rPr>
             <w:rStyle w:val="Hyperlink"/>
@@ -7094,8 +7381,8 @@
         <w:t xml:space="preserve">.</w:t>
       </w:r>
     </w:p>
-    <w:bookmarkEnd w:id="102"/>
-    <w:bookmarkStart w:id="104" w:name="ref-pouyani2022signal"/>
+    <w:bookmarkEnd w:id="108"/>
+    <w:bookmarkStart w:id="110" w:name="ref-pouyani2022signal"/>
     <w:p>
       <w:pPr>
         <w:pStyle w:val="Bibliography"/>
@@ -7119,7 +7406,7 @@
       <w:r>
         <w:t xml:space="preserve"> </w:t>
       </w:r>
-      <w:hyperlink r:id="rId103">
+      <w:hyperlink r:id="rId109">
         <w:r>
           <w:rPr>
             <w:rStyle w:val="Hyperlink"/>
@@ -7131,8 +7418,8 @@
         <w:t xml:space="preserve">.</w:t>
       </w:r>
     </w:p>
-    <w:bookmarkEnd w:id="104"/>
-    <w:bookmarkStart w:id="106" w:name="ref-reyna2023murmur"/>
+    <w:bookmarkEnd w:id="110"/>
+    <w:bookmarkStart w:id="112" w:name="ref-reyna2023murmur"/>
     <w:p>
       <w:pPr>
         <w:pStyle w:val="Bibliography"/>
@@ -7156,7 +7443,7 @@
       <w:r>
         <w:t xml:space="preserve"> </w:t>
       </w:r>
-      <w:hyperlink r:id="rId105">
+      <w:hyperlink r:id="rId111">
         <w:r>
           <w:rPr>
             <w:rStyle w:val="Hyperlink"/>
@@ -7168,8 +7455,8 @@
         <w:t xml:space="preserve">.</w:t>
       </w:r>
     </w:p>
-    <w:bookmarkEnd w:id="106"/>
-    <w:bookmarkStart w:id="108" w:name="ref-rocha2023automatic2"/>
+    <w:bookmarkEnd w:id="112"/>
+    <w:bookmarkStart w:id="114" w:name="ref-rocha2023automatic2"/>
     <w:p>
       <w:pPr>
         <w:pStyle w:val="Bibliography"/>
@@ -7193,7 +7480,7 @@
       <w:r>
         <w:t xml:space="preserve"> </w:t>
       </w:r>
-      <w:hyperlink r:id="rId107">
+      <w:hyperlink r:id="rId113">
         <w:r>
           <w:rPr>
             <w:rStyle w:val="Hyperlink"/>
@@ -7205,8 +7492,8 @@
         <w:t xml:space="preserve">.</w:t>
       </w:r>
     </w:p>
-    <w:bookmarkEnd w:id="108"/>
-    <w:bookmarkStart w:id="110" w:name="ref-roy2024pcgreview"/>
+    <w:bookmarkEnd w:id="114"/>
+    <w:bookmarkStart w:id="116" w:name="ref-roy2024pcgreview"/>
     <w:p>
       <w:pPr>
         <w:pStyle w:val="Bibliography"/>
@@ -7230,7 +7517,7 @@
       <w:r>
         <w:t xml:space="preserve"> </w:t>
       </w:r>
-      <w:hyperlink r:id="rId109">
+      <w:hyperlink r:id="rId115">
         <w:r>
           <w:rPr>
             <w:rStyle w:val="Hyperlink"/>
@@ -7242,8 +7529,8 @@
         <w:t xml:space="preserve">.</w:t>
       </w:r>
     </w:p>
-    <w:bookmarkEnd w:id="110"/>
-    <w:bookmarkStart w:id="112" w:name="ref-shuvo2026self"/>
+    <w:bookmarkEnd w:id="116"/>
+    <w:bookmarkStart w:id="118" w:name="ref-shuvo2026self"/>
     <w:p>
       <w:pPr>
         <w:pStyle w:val="Bibliography"/>
@@ -7267,7 +7554,7 @@
       <w:r>
         <w:t xml:space="preserve"> </w:t>
       </w:r>
-      <w:hyperlink r:id="rId111">
+      <w:hyperlink r:id="rId117">
         <w:r>
           <w:rPr>
             <w:rStyle w:val="Hyperlink"/>
@@ -7279,8 +7566,8 @@
         <w:t xml:space="preserve">.</w:t>
       </w:r>
     </w:p>
-    <w:bookmarkEnd w:id="112"/>
-    <w:bookmarkStart w:id="114" w:name="ref-somarathne2026dual2"/>
+    <w:bookmarkEnd w:id="118"/>
+    <w:bookmarkStart w:id="120" w:name="ref-somarathne2026dual2"/>
     <w:p>
       <w:pPr>
         <w:pStyle w:val="Bibliography"/>
@@ -7304,7 +7591,7 @@
       <w:r>
         <w:t xml:space="preserve"> </w:t>
       </w:r>
-      <w:hyperlink r:id="rId113">
+      <w:hyperlink r:id="rId119">
         <w:r>
           <w:rPr>
             <w:rStyle w:val="Hyperlink"/>
@@ -7316,8 +7603,8 @@
         <w:t xml:space="preserve">.</w:t>
       </w:r>
     </w:p>
-    <w:bookmarkEnd w:id="114"/>
-    <w:bookmarkStart w:id="116" w:name="ref-sun2024daenmfvmd"/>
+    <w:bookmarkEnd w:id="120"/>
+    <w:bookmarkStart w:id="122" w:name="ref-sun2024daenmfvmd"/>
     <w:p>
       <w:pPr>
         <w:pStyle w:val="Bibliography"/>
@@ -7341,7 +7628,7 @@
       <w:r>
         <w:t xml:space="preserve"> </w:t>
       </w:r>
-      <w:hyperlink r:id="rId115">
+      <w:hyperlink r:id="rId121">
         <w:r>
           <w:rPr>
             <w:rStyle w:val="Hyperlink"/>
@@ -7353,8 +7640,8 @@
         <w:t xml:space="preserve">.</w:t>
       </w:r>
     </w:p>
-    <w:bookmarkEnd w:id="116"/>
-    <w:bookmarkStart w:id="118" w:name="ref-torabi2023negative2"/>
+    <w:bookmarkEnd w:id="122"/>
+    <w:bookmarkStart w:id="124" w:name="ref-torabi2023negative2"/>
     <w:p>
       <w:pPr>
         <w:pStyle w:val="Bibliography"/>
@@ -7378,7 +7665,7 @@
       <w:r>
         <w:t xml:space="preserve"> </w:t>
       </w:r>
-      <w:hyperlink r:id="rId117">
+      <w:hyperlink r:id="rId123">
         <w:r>
           <w:rPr>
             <w:rStyle w:val="Hyperlink"/>
@@ -7390,8 +7677,8 @@
         <w:t xml:space="preserve">.</w:t>
       </w:r>
     </w:p>
-    <w:bookmarkEnd w:id="118"/>
-    <w:bookmarkStart w:id="120" w:name="ref-torabi2025hlscmds"/>
+    <w:bookmarkEnd w:id="124"/>
+    <w:bookmarkStart w:id="126" w:name="ref-torabi2025hlscmds"/>
     <w:p>
       <w:pPr>
         <w:pStyle w:val="Bibliography"/>
@@ -7428,7 +7715,7 @@
       <w:r>
         <w:t xml:space="preserve"> </w:t>
       </w:r>
-      <w:hyperlink r:id="rId119">
+      <w:hyperlink r:id="rId125">
         <w:r>
           <w:rPr>
             <w:rStyle w:val="Hyperlink"/>
@@ -7440,8 +7727,8 @@
         <w:t xml:space="preserve">.</w:t>
       </w:r>
     </w:p>
-    <w:bookmarkEnd w:id="120"/>
-    <w:bookmarkStart w:id="122" w:name="ref-torabi2025large2"/>
+    <w:bookmarkEnd w:id="126"/>
+    <w:bookmarkStart w:id="128" w:name="ref-torabi2025large2"/>
     <w:p>
       <w:pPr>
         <w:pStyle w:val="Bibliography"/>
@@ -7465,7 +7752,7 @@
       <w:r>
         <w:t xml:space="preserve"> </w:t>
       </w:r>
-      <w:hyperlink r:id="rId121">
+      <w:hyperlink r:id="rId127">
         <w:r>
           <w:rPr>
             <w:rStyle w:val="Hyperlink"/>
@@ -7477,8 +7764,8 @@
         <w:t xml:space="preserve">.</w:t>
       </w:r>
     </w:p>
-    <w:bookmarkEnd w:id="122"/>
-    <w:bookmarkStart w:id="124" w:name="ref-tsai2023separation2"/>
+    <w:bookmarkEnd w:id="128"/>
+    <w:bookmarkStart w:id="130" w:name="ref-tsai2023separation2"/>
     <w:p>
       <w:pPr>
         <w:pStyle w:val="Bibliography"/>
@@ -7489,7 +7776,7 @@
       <w:r>
         <w:t xml:space="preserve"> </w:t>
       </w:r>
-      <w:hyperlink r:id="rId123">
+      <w:hyperlink r:id="rId129">
         <w:r>
           <w:rPr>
             <w:rStyle w:val="Hyperlink"/>
@@ -7501,8 +7788,8 @@
         <w:t xml:space="preserve">.</w:t>
       </w:r>
     </w:p>
-    <w:bookmarkEnd w:id="124"/>
-    <w:bookmarkStart w:id="126" w:name="ref-ullah2024unsupervised"/>
+    <w:bookmarkEnd w:id="130"/>
+    <w:bookmarkStart w:id="132" w:name="ref-ullah2024unsupervised"/>
     <w:p>
       <w:pPr>
         <w:pStyle w:val="Bibliography"/>
@@ -7526,7 +7813,7 @@
       <w:r>
         <w:t xml:space="preserve"> </w:t>
       </w:r>
-      <w:hyperlink r:id="rId125">
+      <w:hyperlink r:id="rId131">
         <w:r>
           <w:rPr>
             <w:rStyle w:val="Hyperlink"/>
@@ -7538,8 +7825,8 @@
         <w:t xml:space="preserve">.</w:t>
       </w:r>
     </w:p>
-    <w:bookmarkEnd w:id="126"/>
-    <w:bookmarkStart w:id="128" w:name="ref-wang2023mcunet"/>
+    <w:bookmarkEnd w:id="132"/>
+    <w:bookmarkStart w:id="134" w:name="ref-wang2023mcunet"/>
     <w:p>
       <w:pPr>
         <w:pStyle w:val="Bibliography"/>
@@ -7563,7 +7850,7 @@
       <w:r>
         <w:t xml:space="preserve"> </w:t>
       </w:r>
-      <w:hyperlink r:id="rId127">
+      <w:hyperlink r:id="rId133">
         <w:r>
           <w:rPr>
             <w:rStyle w:val="Hyperlink"/>
@@ -7575,8 +7862,8 @@
         <w:t xml:space="preserve">.</w:t>
       </w:r>
     </w:p>
-    <w:bookmarkEnd w:id="128"/>
-    <w:bookmarkStart w:id="130" w:name="ref-wang2023nmfdl"/>
+    <w:bookmarkEnd w:id="134"/>
+    <w:bookmarkStart w:id="136" w:name="ref-wang2023nmfdl"/>
     <w:p>
       <w:pPr>
         <w:pStyle w:val="Bibliography"/>
@@ -7600,7 +7887,7 @@
       <w:r>
         <w:t xml:space="preserve"> </w:t>
       </w:r>
-      <w:hyperlink r:id="rId129">
+      <w:hyperlink r:id="rId135">
         <w:r>
           <w:rPr>
             <w:rStyle w:val="Hyperlink"/>
@@ -7612,8 +7899,8 @@
         <w:t xml:space="preserve">.</w:t>
       </w:r>
     </w:p>
-    <w:bookmarkEnd w:id="130"/>
-    <w:bookmarkStart w:id="132" w:name="ref-wang2025phase2"/>
+    <w:bookmarkEnd w:id="136"/>
+    <w:bookmarkStart w:id="138" w:name="ref-wang2025phase2"/>
     <w:p>
       <w:pPr>
         <w:pStyle w:val="Bibliography"/>
@@ -7637,7 +7924,7 @@
       <w:r>
         <w:t xml:space="preserve"> </w:t>
       </w:r>
-      <w:hyperlink r:id="rId131">
+      <w:hyperlink r:id="rId137">
         <w:r>
           <w:rPr>
             <w:rStyle w:val="Hyperlink"/>
@@ -7649,8 +7936,8 @@
         <w:t xml:space="preserve">.</w:t>
       </w:r>
     </w:p>
-    <w:bookmarkEnd w:id="132"/>
-    <w:bookmarkStart w:id="134" w:name="ref-zhang2025jassnet"/>
+    <w:bookmarkEnd w:id="138"/>
+    <w:bookmarkStart w:id="140" w:name="ref-zhang2025jassnet"/>
     <w:p>
       <w:pPr>
         <w:pStyle w:val="Bibliography"/>
@@ -7674,7 +7961,7 @@
       <w:r>
         <w:t xml:space="preserve"> </w:t>
       </w:r>
-      <w:hyperlink r:id="rId133">
+      <w:hyperlink r:id="rId139">
         <w:r>
           <w:rPr>
             <w:rStyle w:val="Hyperlink"/>
@@ -7686,8 +7973,8 @@
         <w:t xml:space="preserve">.</w:t>
       </w:r>
     </w:p>
-    <w:bookmarkEnd w:id="134"/>
-    <w:bookmarkStart w:id="136" w:name="ref-zhang2026efficient2"/>
+    <w:bookmarkEnd w:id="140"/>
+    <w:bookmarkStart w:id="142" w:name="ref-zhang2026efficient2"/>
     <w:p>
       <w:pPr>
         <w:pStyle w:val="Bibliography"/>
@@ -7711,7 +7998,7 @@
       <w:r>
         <w:t xml:space="preserve"> </w:t>
       </w:r>
-      <w:hyperlink r:id="rId135">
+      <w:hyperlink r:id="rId141">
         <w:r>
           <w:rPr>
             <w:rStyle w:val="Hyperlink"/>
@@ -7723,8 +8010,8 @@
         <w:t xml:space="preserve">.</w:t>
       </w:r>
     </w:p>
-    <w:bookmarkEnd w:id="136"/>
-    <w:bookmarkStart w:id="138" w:name="ref-zhao2024heartanalysis"/>
+    <w:bookmarkEnd w:id="142"/>
+    <w:bookmarkStart w:id="144" w:name="ref-zhao2024heartanalysis"/>
     <w:p>
       <w:pPr>
         <w:pStyle w:val="Bibliography"/>
@@ -7748,7 +8035,7 @@
       <w:r>
         <w:t xml:space="preserve"> </w:t>
       </w:r>
-      <w:hyperlink r:id="rId137">
+      <w:hyperlink r:id="rId143">
         <w:r>
           <w:rPr>
             <w:rStyle w:val="Hyperlink"/>
@@ -7760,8 +8047,8 @@
         <w:t xml:space="preserve">.</w:t>
       </w:r>
     </w:p>
-    <w:bookmarkEnd w:id="138"/>
-    <w:bookmarkStart w:id="140" w:name="ref-zheng2025identifying2"/>
+    <w:bookmarkEnd w:id="144"/>
+    <w:bookmarkStart w:id="146" w:name="ref-zheng2025identifying2"/>
     <w:p>
       <w:pPr>
         <w:pStyle w:val="Bibliography"/>
@@ -7785,7 +8072,7 @@
       <w:r>
         <w:t xml:space="preserve"> </w:t>
       </w:r>
-      <w:hyperlink r:id="rId139">
+      <w:hyperlink r:id="rId145">
         <w:r>
           <w:rPr>
             <w:rStyle w:val="Hyperlink"/>
@@ -7797,8 +8084,8 @@
         <w:t xml:space="preserve">.</w:t>
       </w:r>
     </w:p>
-    <w:bookmarkEnd w:id="140"/>
-    <w:bookmarkStart w:id="142" w:name="ref-zheng2024cardiopulmonary"/>
+    <w:bookmarkEnd w:id="146"/>
+    <w:bookmarkStart w:id="148" w:name="ref-zheng2024cardiopulmonary"/>
     <w:p>
       <w:pPr>
         <w:pStyle w:val="Bibliography"/>
@@ -7822,7 +8109,7 @@
       <w:r>
         <w:t xml:space="preserve"> </w:t>
       </w:r>
-      <w:hyperlink r:id="rId141">
+      <w:hyperlink r:id="rId147">
         <w:r>
           <w:rPr>
             <w:rStyle w:val="Hyperlink"/>
@@ -7834,15 +8121,15 @@
         <w:t xml:space="preserve">.</w:t>
       </w:r>
     </w:p>
-    <w:bookmarkEnd w:id="142"/>
-    <w:bookmarkEnd w:id="143"/>
+    <w:bookmarkEnd w:id="148"/>
+    <w:bookmarkEnd w:id="149"/>
     <w:p>
       <w:r>
         <w:br w:type="page"/>
       </w:r>
     </w:p>
-    <w:bookmarkEnd w:id="144"/>
-    <w:bookmarkStart w:id="145" w:name="appendix-a-gantt-chart"/>
+    <w:bookmarkEnd w:id="150"/>
+    <w:bookmarkStart w:id="151" w:name="appendix-a-gantt-chart"/>
     <w:p>
       <w:pPr>
         <w:pStyle w:val="Heading1"/>
@@ -7864,8 +8151,8 @@
         <w:br w:type="page"/>
       </w:r>
     </w:p>
-    <w:bookmarkEnd w:id="145"/>
-    <w:bookmarkStart w:id="146" w:name="appendix-b-fyp-i-meeting-logs"/>
+    <w:bookmarkEnd w:id="151"/>
+    <w:bookmarkStart w:id="152" w:name="appendix-b-fyp-i-meeting-logs"/>
     <w:p>
       <w:pPr>
         <w:pStyle w:val="Heading1"/>
@@ -7887,8 +8174,8 @@
         <w:br w:type="page"/>
       </w:r>
     </w:p>
-    <w:bookmarkEnd w:id="146"/>
-    <w:bookmarkStart w:id="147" w:name="Xe32b85fb62951c87beaae793b5e5d26fe8e8d89"/>
+    <w:bookmarkEnd w:id="152"/>
+    <w:bookmarkStart w:id="153" w:name="Xe32b85fb62951c87beaae793b5e5d26fe8e8d89"/>
     <w:p>
       <w:pPr>
         <w:pStyle w:val="Heading1"/>
@@ -7910,8 +8197,8 @@
         <w:br w:type="page"/>
       </w:r>
     </w:p>
-    <w:bookmarkEnd w:id="147"/>
-    <w:bookmarkStart w:id="148" w:name="appendix-d-technical-documentation"/>
+    <w:bookmarkEnd w:id="153"/>
+    <w:bookmarkStart w:id="154" w:name="appendix-d-technical-documentation"/>
     <w:p>
       <w:pPr>
         <w:pStyle w:val="Heading1"/>
@@ -7928,15 +8215,13 @@
         <w:t xml:space="preserve">Placeholder for technical documentation, specification documents, design documents, and prototype code listings if needed.</w:t>
       </w:r>
     </w:p>
-    <w:bookmarkEnd w:id="148"/>
+    <w:bookmarkEnd w:id="154"/>
     <w:sectPr>
-      <w:headerReference r:id="rId8" w:type="default"/>
-      <w:footerReference r:id="rId9" w:type="default"/>
+      <w:headerReference w:type="default" r:id="rId8"/>
+      <w:footerReference w:type="default" r:id="rId9"/>
+      <w:pgNumType w:fmt="decimal" w:start="1"/>
       <w:pgSz w:h="15840" w:w="12240"/>
-      <w:pgMar w:bottom="1588" w:footer="720" w:gutter="0" w:header="720" w:left="2155" w:right="1588" w:top="1588"/>
-      <w:pgNumType w:fmt="lowerRoman" w:start="3"/>
-      <w:cols w:space="720"/>
-      <w:docGrid w:linePitch="360"/>
+      <w:pgMar w:top="1587" w:right="1587" w:bottom="1587" w:left="2154" w:header="720" w:footer="720" w:gutter="0"/>
     </w:sectPr>
   </w:body>
 </w:document>
@@ -7947,58 +8232,75 @@
 </file>
 
 <file path=word/footer1.xml><?xml version="1.0" encoding="utf-8"?>
-<w:ftr xmlns:wpc="http://schemas.microsoft.com/office/word/2010/wordprocessingCanvas" xmlns:cx="http://schemas.microsoft.com/office/drawing/2014/chartex" xmlns:cx1="http://schemas.microsoft.com/office/drawing/2015/9/8/chartex" xmlns:cx2="http://schemas.microsoft.com/office/drawing/2015/10/21/chartex" xmlns:cx3="http://schemas.microsoft.com/office/drawing/2016/5/9/chartex" xmlns:cx4="http://schemas.microsoft.com/office/drawing/2016/5/10/chartex" xmlns:cx5="http://schemas.microsoft.com/office/drawing/2016/5/11/chartex" xmlns:cx6="http://schemas.microsoft.com/office/drawing/2016/5/12/chartex" xmlns:cx7="http://schemas.microsoft.com/office/drawing/2016/5/13/chartex" xmlns:cx8="http://schemas.microsoft.com/office/drawing/2016/5/14/chartex" xmlns:mc="http://schemas.openxmlformats.org/markup-compatibility/2006" xmlns:aink="http://schemas.microsoft.com/office/drawing/2016/ink" xmlns:am3d="http://schemas.microsoft.com/office/drawing/2017/model3d" xmlns:o="urn:schemas-microsoft-com:office:office" xmlns:oel="http://schemas.microsoft.com/office/2019/extlst" xmlns:r="http://schemas.openxmlformats.org/officeDocument/2006/relationships" xmlns:m="http://schemas.openxmlformats.org/officeDocument/2006/math" xmlns:v="urn:schemas-microsoft-com:vml" xmlns:wp14="http://schemas.microsoft.com/office/word/2010/wordprocessingDrawing" xmlns:wp="http://schemas.openxmlformats.org/drawingml/2006/wordprocessingDrawing" xmlns:w10="urn:schemas-microsoft-com:office:word" xmlns:w="http://schemas.openxmlformats.org/wordprocessingml/2006/main" xmlns:w14="http://schemas.microsoft.com/office/word/2010/wordml" xmlns:w15="http://schemas.microsoft.com/office/word/2012/wordml" xmlns:w16cex="http://schemas.microsoft.com/office/word/2018/wordml/cex" xmlns:w16cid="http://schemas.microsoft.com/office/word/2016/wordml/cid" xmlns:w16="http://schemas.microsoft.com/office/word/2018/wordml" xmlns:w16du="http://schemas.microsoft.com/office/word/2023/wordml/word16du" xmlns:w16sdtdh="http://schemas.microsoft.com/office/word/2020/wordml/sdtdatahash" xmlns:w16sdtfl="http://schemas.microsoft.com/office/word/2024/wordml/sdtformatlock" xmlns:w16se="http://schemas.microsoft.com/office/word/2015/wordml/symex" xmlns:wpg="http://schemas.microsoft.com/office/word/2010/wordprocessingGroup" xmlns:wpi="http://schemas.microsoft.com/office/word/2010/wordprocessingInk" xmlns:wne="http://schemas.microsoft.com/office/word/2006/wordml" xmlns:wps="http://schemas.microsoft.com/office/word/2010/wordprocessingShape" mc:Ignorable="w14 w15 w16se w16cid w16 w16cex w16sdtdh w16sdtfl w16du wp14">
-  <w:p>
-    <w:pPr>
-      <w:pStyle w:val="Footer"/>
-      <w:pBdr>
-        <w:bottom w:val="single" w:sz="12" w:space="1" w:color="auto"/>
-      </w:pBdr>
-      <w:tabs>
-        <w:tab w:val="left" w:pos="8505"/>
-      </w:tabs>
-      <w:ind w:right="-8"/>
-      <w:rPr>
-        <w:sz w:val="16"/>
-        <w:szCs w:val="16"/>
-      </w:rPr>
-    </w:pPr>
-  </w:p>
-  <w:p>
-    <w:pPr>
-      <w:pStyle w:val="Footer"/>
-      <w:tabs>
-        <w:tab w:val="left" w:pos="8505"/>
-      </w:tabs>
-      <w:ind w:right="-8"/>
-    </w:pPr>
-    <w:r>
-      <w:rPr>
-        <w:sz w:val="16"/>
-        <w:szCs w:val="16"/>
-      </w:rPr>
-      <w:t>Prepared by:                                                                   CPT6314 Project I                                                       2</w:t>
-    </w:r>
-    <w:r>
-      <w:rPr>
-        <w:sz w:val="16"/>
-        <w:szCs w:val="16"/>
-      </w:rPr>
-      <w:t>5</w:t>
-    </w:r>
-    <w:r>
-      <w:rPr>
-        <w:sz w:val="16"/>
-        <w:szCs w:val="16"/>
-      </w:rPr>
-      <w:t>30 Term</w:t>
-    </w:r>
-  </w:p>
-  <w:p>
-    <w:pPr>
-      <w:pStyle w:val="Footer"/>
-    </w:pPr>
-  </w:p>
+<w:ftr xmlns:w="http://schemas.openxmlformats.org/wordprocessingml/2006/main" xmlns:r="http://schemas.openxmlformats.org/officeDocument/2006/relationships">
+  <w:tbl>
+    <w:tblPr>
+      <w:tblW w:w="0" w:type="auto"/>
+      <w:tblBorders>
+        <w:top w:val="nil"/>
+        <w:left w:val="nil"/>
+        <w:bottom w:val="nil"/>
+        <w:right w:val="nil"/>
+        <w:insideH w:val="nil"/>
+        <w:insideV w:val="nil"/>
+      </w:tblBorders>
+    </w:tblPr>
+    <w:tblGrid>
+      <w:gridCol w:w="4300"/>
+      <w:gridCol w:w="1700"/>
+      <w:gridCol w:w="2000"/>
+    </w:tblGrid>
+    <w:tr>
+      <w:tc>
+        <w:tcPr>
+          <w:tcW w:w="4300" w:type="dxa"/>
+        </w:tcPr>
+        <w:p>
+          <w:r>
+            <w:rPr>
+              <w:sz w:val="16"/>
+              <w:szCs w:val="16"/>
+            </w:rPr>
+            <w:t>Prepared by: AL-SALOUL, ASHRAF ALI HUSSEIN</w:t>
+          </w:r>
+        </w:p>
+      </w:tc>
+      <w:tc>
+        <w:tcPr>
+          <w:tcW w:w="1700" w:type="dxa"/>
+        </w:tcPr>
+        <w:p>
+          <w:pPr>
+            <w:jc w:val="center"/>
+          </w:pPr>
+          <w:r>
+            <w:rPr>
+              <w:sz w:val="16"/>
+              <w:szCs w:val="16"/>
+            </w:rPr>
+            <w:t>CPT6314</w:t>
+          </w:r>
+        </w:p>
+      </w:tc>
+      <w:tc>
+        <w:tcPr>
+          <w:tcW w:w="2000" w:type="dxa"/>
+        </w:tcPr>
+        <w:p>
+          <w:pPr>
+            <w:jc w:val="right"/>
+          </w:pPr>
+          <w:r>
+            <w:rPr>
+              <w:sz w:val="16"/>
+              <w:szCs w:val="16"/>
+            </w:rPr>
+            <w:t>2610 Term</w:t>
+          </w:r>
+        </w:p>
+      </w:tc>
+    </w:tr>
+  </w:tbl>
 </w:ftr>
 </file>
 
@@ -8022,85 +8324,85 @@
 </file>
 
 <file path=word/header1.xml><?xml version="1.0" encoding="utf-8"?>
-<w:hdr xmlns:wpc="http://schemas.microsoft.com/office/word/2010/wordprocessingCanvas" xmlns:cx="http://schemas.microsoft.com/office/drawing/2014/chartex" xmlns:cx1="http://schemas.microsoft.com/office/drawing/2015/9/8/chartex" xmlns:cx2="http://schemas.microsoft.com/office/drawing/2015/10/21/chartex" xmlns:cx3="http://schemas.microsoft.com/office/drawing/2016/5/9/chartex" xmlns:cx4="http://schemas.microsoft.com/office/drawing/2016/5/10/chartex" xmlns:cx5="http://schemas.microsoft.com/office/drawing/2016/5/11/chartex" xmlns:cx6="http://schemas.microsoft.com/office/drawing/2016/5/12/chartex" xmlns:cx7="http://schemas.microsoft.com/office/drawing/2016/5/13/chartex" xmlns:cx8="http://schemas.microsoft.com/office/drawing/2016/5/14/chartex" xmlns:mc="http://schemas.openxmlformats.org/markup-compatibility/2006" xmlns:aink="http://schemas.microsoft.com/office/drawing/2016/ink" xmlns:am3d="http://schemas.microsoft.com/office/drawing/2017/model3d" xmlns:o="urn:schemas-microsoft-com:office:office" xmlns:oel="http://schemas.microsoft.com/office/2019/extlst" xmlns:r="http://schemas.openxmlformats.org/officeDocument/2006/relationships" xmlns:m="http://schemas.openxmlformats.org/officeDocument/2006/math" xmlns:v="urn:schemas-microsoft-com:vml" xmlns:wp14="http://schemas.microsoft.com/office/word/2010/wordprocessingDrawing" xmlns:wp="http://schemas.openxmlformats.org/drawingml/2006/wordprocessingDrawing" xmlns:w10="urn:schemas-microsoft-com:office:word" xmlns:w="http://schemas.openxmlformats.org/wordprocessingml/2006/main" xmlns:w14="http://schemas.microsoft.com/office/word/2010/wordml" xmlns:w15="http://schemas.microsoft.com/office/word/2012/wordml" xmlns:w16cex="http://schemas.microsoft.com/office/word/2018/wordml/cex" xmlns:w16cid="http://schemas.microsoft.com/office/word/2016/wordml/cid" xmlns:w16="http://schemas.microsoft.com/office/word/2018/wordml" xmlns:w16du="http://schemas.microsoft.com/office/word/2023/wordml/word16du" xmlns:w16sdtdh="http://schemas.microsoft.com/office/word/2020/wordml/sdtdatahash" xmlns:w16sdtfl="http://schemas.microsoft.com/office/word/2024/wordml/sdtformatlock" xmlns:w16se="http://schemas.microsoft.com/office/word/2015/wordml/symex" xmlns:wpg="http://schemas.microsoft.com/office/word/2010/wordprocessingGroup" xmlns:wpi="http://schemas.microsoft.com/office/word/2010/wordprocessingInk" xmlns:wne="http://schemas.microsoft.com/office/word/2006/wordml" xmlns:wps="http://schemas.microsoft.com/office/word/2010/wordprocessingShape" mc:Ignorable="w14 w15 w16se w16cid w16 w16cex w16sdtdh w16sdtfl w16du wp14">
-  <w:p>
-    <w:pPr>
-      <w:pStyle w:val="Header"/>
-      <w:pBdr>
-        <w:bottom w:val="single" w:sz="4" w:space="1" w:color="auto"/>
-      </w:pBdr>
-    </w:pPr>
-    <w:r>
-      <w:rPr>
-        <w:sz w:val="16"/>
-        <w:szCs w:val="16"/>
-      </w:rPr>
-      <w:tab/>
-    </w:r>
-    <w:r>
-      <w:rPr>
-        <w:sz w:val="16"/>
-        <w:szCs w:val="16"/>
-      </w:rPr>
-      <w:tab/>
-    </w:r>
-    <w:r>
-      <w:rPr>
-        <w:rStyle w:val="PageNumber"/>
-        <w:sz w:val="20"/>
-      </w:rPr>
-      <w:fldChar w:fldCharType="begin"/>
-    </w:r>
-    <w:r>
-      <w:rPr>
-        <w:rStyle w:val="PageNumber"/>
-        <w:sz w:val="20"/>
-      </w:rPr>
-      <w:instrText xml:space="preserve"> PAGE </w:instrText>
-    </w:r>
-    <w:r>
-      <w:rPr>
-        <w:rStyle w:val="PageNumber"/>
-        <w:sz w:val="20"/>
-      </w:rPr>
-      <w:fldChar w:fldCharType="separate"/>
-    </w:r>
-    <w:r>
-      <w:rPr>
-        <w:rStyle w:val="PageNumber"/>
-        <w:sz w:val="20"/>
-      </w:rPr>
-      <w:t>i</w:t>
-    </w:r>
-    <w:r>
-      <w:rPr>
-        <w:rStyle w:val="PageNumber"/>
-        <w:sz w:val="20"/>
-      </w:rPr>
-      <w:fldChar w:fldCharType="end"/>
-    </w:r>
-    <w:r>
-      <w:rPr>
-        <w:sz w:val="16"/>
-        <w:szCs w:val="16"/>
-      </w:rPr>
-      <w:br/>
-      <w:t>Project ID:</w:t>
-    </w:r>
-    <w:r>
-      <w:rPr>
-        <w:sz w:val="16"/>
-        <w:szCs w:val="16"/>
-        <w:u w:val="single"/>
-      </w:rPr>
-      <w:t xml:space="preserve">         </w:t>
-    </w:r>
-  </w:p>
-  <w:p>
-    <w:pPr>
-      <w:pStyle w:val="Header"/>
-    </w:pPr>
-  </w:p>
+<w:hdr xmlns:w="http://schemas.openxmlformats.org/wordprocessingml/2006/main" xmlns:r="http://schemas.openxmlformats.org/officeDocument/2006/relationships">
+  <w:tbl>
+    <w:tblPr>
+      <w:tblW w:w="0" w:type="auto"/>
+      <w:tblBorders>
+        <w:top w:val="nil"/>
+        <w:left w:val="nil"/>
+        <w:bottom w:val="nil"/>
+        <w:right w:val="nil"/>
+        <w:insideH w:val="nil"/>
+        <w:insideV w:val="nil"/>
+      </w:tblBorders>
+    </w:tblPr>
+    <w:tblGrid>
+      <w:gridCol w:w="5000"/>
+      <w:gridCol w:w="3000"/>
+    </w:tblGrid>
+    <w:tr>
+      <w:tc>
+        <w:tcPr>
+          <w:tcW w:w="5000" w:type="dxa"/>
+        </w:tcPr>
+        <w:p>
+          <w:r>
+            <w:rPr>
+              <w:sz w:val="20"/>
+              <w:szCs w:val="20"/>
+            </w:rPr>
+            <w:t>Project ID: 985</w:t>
+          </w:r>
+        </w:p>
+      </w:tc>
+      <w:tc>
+        <w:tcPr>
+          <w:tcW w:w="3000" w:type="dxa"/>
+        </w:tcPr>
+        <w:p>
+          <w:pPr>
+            <w:jc w:val="right"/>
+          </w:pPr>
+          <w:r>
+            <w:rPr>
+              <w:sz w:val="20"/>
+              <w:szCs w:val="20"/>
+            </w:rPr>
+            <w:fldChar w:fldCharType="begin"/>
+          </w:r>
+          <w:r>
+            <w:rPr>
+              <w:sz w:val="20"/>
+              <w:szCs w:val="20"/>
+            </w:rPr>
+            <w:instrText xml:space="preserve"> PAGE </w:instrText>
+          </w:r>
+          <w:r>
+            <w:rPr>
+              <w:sz w:val="20"/>
+              <w:szCs w:val="20"/>
+            </w:rPr>
+            <w:fldChar w:fldCharType="separate"/>
+          </w:r>
+          <w:r>
+            <w:rPr>
+              <w:sz w:val="20"/>
+              <w:szCs w:val="20"/>
+            </w:rPr>
+            <w:t>i</w:t>
+          </w:r>
+          <w:r>
+            <w:rPr>
+              <w:sz w:val="20"/>
+              <w:szCs w:val="20"/>
+            </w:rPr>
+            <w:fldChar w:fldCharType="end"/>
+          </w:r>
+        </w:p>
+      </w:tc>
+    </w:tr>
+  </w:tbl>
 </w:hdr>
 </file>
 
@@ -9632,10 +9934,6 @@
     <w:qFormat/>
     <w:rsid w:val="002A30CA"/>
     <w:pPr>
-      <w:numPr>
-        <w:ilvl w:val="1"/>
-        <w:numId w:val="2"/>
-      </w:numPr>
       <w:outlineLvl w:val="1"/>
     </w:pPr>
     <w:rPr>
@@ -9653,9 +9951,6 @@
     <w:qFormat/>
     <w:rsid w:val="006540D8"/>
     <w:pPr>
-      <w:numPr>
-        <w:numId w:val="5"/>
-      </w:numPr>
       <w:outlineLvl w:val="2"/>
     </w:pPr>
     <w:rPr>

</xml_diff>

<commit_message>
Make report front matter lists navigatable
</commit_message>
<xml_diff>
--- a/report/generated/paper.docx
+++ b/report/generated/paper.docx
@@ -388,268 +388,263 @@
         <w:t xml:space="preserve">List of Tables</w:t>
       </w:r>
     </w:p>
-    <w:tbl>
-      <w:tblPr>
-        <w:tblStyle w:val="Table"/>
-        <w:tblW w:type="pct" w:w="5000"/>
-        <w:tblLayout w:type="fixed"/>
-        <w:tblLook w:firstRow="1" w:lastRow="0" w:firstColumn="0" w:lastColumn="0" w:noHBand="0" w:noVBand="0" w:val="0020"/>
-      </w:tblPr>
-      <w:tblGrid>
-        <w:gridCol w:w="3960"/>
-        <w:gridCol w:w="3960"/>
-      </w:tblGrid>
-      <w:tr>
-        <w:trPr>
-          <w:tblHeader w:val="on"/>
-        </w:trPr>
-        <w:tc>
-          <w:tcPr/>
-          <w:p>
-            <w:pPr>
-              <w:pStyle w:val="Compact"/>
-            </w:pPr>
-            <w:r>
-              <w:t xml:space="preserve">Table</w:t>
-            </w:r>
-          </w:p>
-        </w:tc>
-        <w:tc>
-          <w:tcPr/>
-          <w:p>
-            <w:pPr>
-              <w:pStyle w:val="Compact"/>
-            </w:pPr>
-            <w:r>
-              <w:t xml:space="preserve">Description</w:t>
-            </w:r>
-          </w:p>
-        </w:tc>
-      </w:tr>
-      <w:tr>
-        <w:tc>
-          <w:tcPr/>
-          <w:p>
-            <w:pPr>
-              <w:pStyle w:val="Compact"/>
-            </w:pPr>
-            <w:r>
-              <w:t xml:space="preserve">Table 1</w:t>
-            </w:r>
-          </w:p>
-        </w:tc>
-        <w:tc>
-          <w:tcPr/>
-          <w:p>
-            <w:pPr>
-              <w:pStyle w:val="Compact"/>
-            </w:pPr>
-            <w:r>
-              <w:t xml:space="preserve">Summary literature review matrix for key cardiopulmonary sound separation studies</w:t>
-            </w:r>
-          </w:p>
-        </w:tc>
-      </w:tr>
-      <w:tr>
-        <w:tc>
-          <w:tcPr/>
-          <w:p>
-            <w:pPr>
-              <w:pStyle w:val="Compact"/>
-            </w:pPr>
-            <w:r>
-              <w:t xml:space="preserve">Table 2</w:t>
-            </w:r>
-          </w:p>
-        </w:tc>
-        <w:tc>
-          <w:tcPr/>
-          <w:p>
-            <w:pPr>
-              <w:pStyle w:val="Compact"/>
-            </w:pPr>
-            <w:r>
-              <w:t xml:space="preserve">Main system modules and responsibilities</w:t>
-            </w:r>
-          </w:p>
-        </w:tc>
-      </w:tr>
-      <w:tr>
-        <w:tc>
-          <w:tcPr/>
-          <w:p>
-            <w:pPr>
-              <w:pStyle w:val="Compact"/>
-            </w:pPr>
-            <w:r>
-              <w:t xml:space="preserve">Table 3</w:t>
-            </w:r>
-          </w:p>
-        </w:tc>
-        <w:tc>
-          <w:tcPr/>
-          <w:p>
-            <w:pPr>
-              <w:pStyle w:val="Compact"/>
-            </w:pPr>
-            <w:r>
-              <w:t xml:space="preserve">Planned database and storage records</w:t>
-            </w:r>
-          </w:p>
-        </w:tc>
-      </w:tr>
-      <w:tr>
-        <w:tc>
-          <w:tcPr/>
-          <w:p>
-            <w:pPr>
-              <w:pStyle w:val="Compact"/>
-            </w:pPr>
-            <w:r>
-              <w:t xml:space="preserve">Table 4</w:t>
-            </w:r>
-          </w:p>
-        </w:tc>
-        <w:tc>
-          <w:tcPr/>
-          <w:p>
-            <w:pPr>
-              <w:pStyle w:val="Compact"/>
-            </w:pPr>
-            <w:r>
-              <w:t xml:space="preserve">Planned functional test cases</w:t>
-            </w:r>
-          </w:p>
-        </w:tc>
-      </w:tr>
-      <w:tr>
-        <w:tc>
-          <w:tcPr/>
-          <w:p>
-            <w:pPr>
-              <w:pStyle w:val="Compact"/>
-            </w:pPr>
-            <w:r>
-              <w:t xml:space="preserve">Table 5</w:t>
-            </w:r>
-          </w:p>
-        </w:tc>
-        <w:tc>
-          <w:tcPr/>
-          <w:p>
-            <w:pPr>
-              <w:pStyle w:val="Compact"/>
-            </w:pPr>
-            <w:r>
-              <w:t xml:space="preserve">Planned audio separation evaluation metrics</w:t>
-            </w:r>
-          </w:p>
-        </w:tc>
-      </w:tr>
-      <w:tr>
-        <w:tc>
-          <w:tcPr/>
-          <w:p>
-            <w:pPr>
-              <w:pStyle w:val="Compact"/>
-            </w:pPr>
-            <w:r>
-              <w:t xml:space="preserve">Table 6</w:t>
-            </w:r>
-          </w:p>
-        </w:tc>
-        <w:tc>
-          <w:tcPr/>
-          <w:p>
-            <w:pPr>
-              <w:pStyle w:val="Compact"/>
-            </w:pPr>
-            <w:r>
-              <w:t xml:space="preserve">Full literature review matrix for selected Chapter 2 papers</w:t>
-            </w:r>
-          </w:p>
-        </w:tc>
-      </w:tr>
-      <w:tr>
-        <w:tc>
-          <w:tcPr/>
-          <w:p>
-            <w:pPr>
-              <w:pStyle w:val="Compact"/>
-            </w:pPr>
-            <w:r>
-              <w:t xml:space="preserve">Table 7</w:t>
-            </w:r>
-          </w:p>
-        </w:tc>
-        <w:tc>
-          <w:tcPr/>
-          <w:p>
-            <w:pPr>
-              <w:pStyle w:val="Compact"/>
-            </w:pPr>
-            <w:r>
-              <w:t xml:space="preserve">PRISMA screening summary for the literature review</w:t>
-            </w:r>
-          </w:p>
-        </w:tc>
-      </w:tr>
-      <w:tr>
-        <w:tc>
-          <w:tcPr/>
-          <w:p>
-            <w:pPr>
-              <w:pStyle w:val="Compact"/>
-            </w:pPr>
-            <w:r>
-              <w:t xml:space="preserve">Table 8</w:t>
-            </w:r>
-          </w:p>
-        </w:tc>
-        <w:tc>
-          <w:tcPr/>
-          <w:p>
-            <w:pPr>
-              <w:pStyle w:val="Compact"/>
-            </w:pPr>
-            <w:r>
-              <w:t xml:space="preserve">System design diagram summary</w:t>
-            </w:r>
-          </w:p>
-        </w:tc>
-      </w:tr>
-      <w:tr>
-        <w:tc>
-          <w:tcPr/>
-          <w:p>
-            <w:pPr>
-              <w:pStyle w:val="Compact"/>
-            </w:pPr>
-            <w:r>
-              <w:t xml:space="preserve">Table 9</w:t>
-            </w:r>
-          </w:p>
-        </w:tc>
-        <w:tc>
-          <w:tcPr/>
-          <w:p>
-            <w:pPr>
-              <w:pStyle w:val="Compact"/>
-            </w:pPr>
-            <w:r>
-              <w:t xml:space="preserve">Appendix planned test cases and evaluation checks</w:t>
-            </w:r>
-          </w:p>
-        </w:tc>
-      </w:tr>
-    </w:tbl>
+    <w:p>
+      <w:pPr>
+        <w:pStyle w:val="TOC1"/>
+      </w:pPr>
+      <w:hyperlink w:anchor="_FYPTable001" w:history="1">
+        <w:r>
+          <w:rPr>
+            <w:rStyle w:val="Hyperlink"/>
+          </w:rPr>
+          <w:t>Table 2.1: Summary literature review matrix for key cardiopulmonary sound separation studies</w:t>
+        </w:r>
+      </w:hyperlink>
+      <w:r>
+        <w:tab/>
+      </w:r>
+      <w:r>
+        <w:fldChar w:fldCharType="begin"/>
+      </w:r>
+      <w:r>
+        <w:instrText xml:space="preserve"> PAGEREF _FYPTable001 \h </w:instrText>
+      </w:r>
+      <w:r>
+        <w:fldChar w:fldCharType="separate"/>
+      </w:r>
+      <w:r>
+        <w:fldChar w:fldCharType="end"/>
+      </w:r>
+    </w:p>
+    <w:p>
+      <w:pPr>
+        <w:pStyle w:val="TOC1"/>
+      </w:pPr>
+      <w:hyperlink w:anchor="_FYPTable002" w:history="1">
+        <w:r>
+          <w:rPr>
+            <w:rStyle w:val="Hyperlink"/>
+          </w:rPr>
+          <w:t>Table 4.1: Main system modules and responsibilities</w:t>
+        </w:r>
+      </w:hyperlink>
+      <w:r>
+        <w:tab/>
+      </w:r>
+      <w:r>
+        <w:fldChar w:fldCharType="begin"/>
+      </w:r>
+      <w:r>
+        <w:instrText xml:space="preserve"> PAGEREF _FYPTable002 \h </w:instrText>
+      </w:r>
+      <w:r>
+        <w:fldChar w:fldCharType="separate"/>
+      </w:r>
+      <w:r>
+        <w:fldChar w:fldCharType="end"/>
+      </w:r>
+    </w:p>
+    <w:p>
+      <w:pPr>
+        <w:pStyle w:val="TOC1"/>
+      </w:pPr>
+      <w:hyperlink w:anchor="_FYPTable003" w:history="1">
+        <w:r>
+          <w:rPr>
+            <w:rStyle w:val="Hyperlink"/>
+          </w:rPr>
+          <w:t>Table 4.2: Planned database and storage records</w:t>
+        </w:r>
+      </w:hyperlink>
+      <w:r>
+        <w:tab/>
+      </w:r>
+      <w:r>
+        <w:fldChar w:fldCharType="begin"/>
+      </w:r>
+      <w:r>
+        <w:instrText xml:space="preserve"> PAGEREF _FYPTable003 \h </w:instrText>
+      </w:r>
+      <w:r>
+        <w:fldChar w:fldCharType="separate"/>
+      </w:r>
+      <w:r>
+        <w:fldChar w:fldCharType="end"/>
+      </w:r>
+    </w:p>
+    <w:p>
+      <w:pPr>
+        <w:pStyle w:val="TOC1"/>
+      </w:pPr>
+      <w:hyperlink w:anchor="_FYPTable004" w:history="1">
+        <w:r>
+          <w:rPr>
+            <w:rStyle w:val="Hyperlink"/>
+          </w:rPr>
+          <w:t>Table 5.1: Planned functional test cases</w:t>
+        </w:r>
+      </w:hyperlink>
+      <w:r>
+        <w:tab/>
+      </w:r>
+      <w:r>
+        <w:fldChar w:fldCharType="begin"/>
+      </w:r>
+      <w:r>
+        <w:instrText xml:space="preserve"> PAGEREF _FYPTable004 \h </w:instrText>
+      </w:r>
+      <w:r>
+        <w:fldChar w:fldCharType="separate"/>
+      </w:r>
+      <w:r>
+        <w:fldChar w:fldCharType="end"/>
+      </w:r>
+    </w:p>
+    <w:p>
+      <w:pPr>
+        <w:pStyle w:val="TOC1"/>
+      </w:pPr>
+      <w:hyperlink w:anchor="_FYPTable005" w:history="1">
+        <w:r>
+          <w:rPr>
+            <w:rStyle w:val="Hyperlink"/>
+          </w:rPr>
+          <w:t>Table 5.2: Planned audio separation evaluation metrics</w:t>
+        </w:r>
+      </w:hyperlink>
+      <w:r>
+        <w:tab/>
+      </w:r>
+      <w:r>
+        <w:fldChar w:fldCharType="begin"/>
+      </w:r>
+      <w:r>
+        <w:instrText xml:space="preserve"> PAGEREF _FYPTable005 \h </w:instrText>
+      </w:r>
+      <w:r>
+        <w:fldChar w:fldCharType="separate"/>
+      </w:r>
+      <w:r>
+        <w:fldChar w:fldCharType="end"/>
+      </w:r>
+    </w:p>
+    <w:p>
+      <w:pPr>
+        <w:pStyle w:val="TOC1"/>
+      </w:pPr>
+      <w:hyperlink w:anchor="_FYPTable006" w:history="1">
+        <w:r>
+          <w:rPr>
+            <w:rStyle w:val="Hyperlink"/>
+          </w:rPr>
+          <w:t>Table 5.3: Full literature review matrix for selected Chapter 2 papers</w:t>
+        </w:r>
+      </w:hyperlink>
+      <w:r>
+        <w:tab/>
+      </w:r>
+      <w:r>
+        <w:fldChar w:fldCharType="begin"/>
+      </w:r>
+      <w:r>
+        <w:instrText xml:space="preserve"> PAGEREF _FYPTable006 \h </w:instrText>
+      </w:r>
+      <w:r>
+        <w:fldChar w:fldCharType="separate"/>
+      </w:r>
+      <w:r>
+        <w:fldChar w:fldCharType="end"/>
+      </w:r>
+    </w:p>
+    <w:p>
+      <w:pPr>
+        <w:pStyle w:val="TOC1"/>
+      </w:pPr>
+      <w:hyperlink w:anchor="_FYPTable007" w:history="1">
+        <w:r>
+          <w:rPr>
+            <w:rStyle w:val="Hyperlink"/>
+          </w:rPr>
+          <w:t>Table 5.4: PRISMA screening summary for the literature review</w:t>
+        </w:r>
+      </w:hyperlink>
+      <w:r>
+        <w:tab/>
+      </w:r>
+      <w:r>
+        <w:fldChar w:fldCharType="begin"/>
+      </w:r>
+      <w:r>
+        <w:instrText xml:space="preserve"> PAGEREF _FYPTable007 \h </w:instrText>
+      </w:r>
+      <w:r>
+        <w:fldChar w:fldCharType="separate"/>
+      </w:r>
+      <w:r>
+        <w:fldChar w:fldCharType="end"/>
+      </w:r>
+    </w:p>
+    <w:p>
+      <w:pPr>
+        <w:pStyle w:val="TOC1"/>
+      </w:pPr>
+      <w:hyperlink w:anchor="_FYPTable008" w:history="1">
+        <w:r>
+          <w:rPr>
+            <w:rStyle w:val="Hyperlink"/>
+          </w:rPr>
+          <w:t>Table 5.5: System design diagram summary</w:t>
+        </w:r>
+      </w:hyperlink>
+      <w:r>
+        <w:tab/>
+      </w:r>
+      <w:r>
+        <w:fldChar w:fldCharType="begin"/>
+      </w:r>
+      <w:r>
+        <w:instrText xml:space="preserve"> PAGEREF _FYPTable008 \h </w:instrText>
+      </w:r>
+      <w:r>
+        <w:fldChar w:fldCharType="separate"/>
+      </w:r>
+      <w:r>
+        <w:fldChar w:fldCharType="end"/>
+      </w:r>
+    </w:p>
+    <w:p>
+      <w:pPr>
+        <w:pStyle w:val="TOC1"/>
+      </w:pPr>
+      <w:hyperlink w:anchor="_FYPTable009" w:history="1">
+        <w:r>
+          <w:rPr>
+            <w:rStyle w:val="Hyperlink"/>
+          </w:rPr>
+          <w:t>Table 5.6: Appendix planned test cases and evaluation checks</w:t>
+        </w:r>
+      </w:hyperlink>
+      <w:r>
+        <w:tab/>
+      </w:r>
+      <w:r>
+        <w:fldChar w:fldCharType="begin"/>
+      </w:r>
+      <w:r>
+        <w:instrText xml:space="preserve"> PAGEREF _FYPTable009 \h </w:instrText>
+      </w:r>
+      <w:r>
+        <w:fldChar w:fldCharType="separate"/>
+      </w:r>
+      <w:r>
+        <w:fldChar w:fldCharType="end"/>
+      </w:r>
+    </w:p>
     <w:p>
       <w:r>
         <w:br w:type="page"/>
       </w:r>
     </w:p>
-    <w:bookmarkEnd w:id="23"/>
-    <w:bookmarkStart w:id="24" w:name="list-of-figures"/>
     <w:p>
       <w:pPr>
         <w:pStyle w:val="Heading1"/>
@@ -658,172 +653,151 @@
         <w:t xml:space="preserve">List of Figures</w:t>
       </w:r>
     </w:p>
-    <w:tbl>
-      <w:tblPr>
-        <w:tblStyle w:val="Table"/>
-        <w:tblW w:type="pct" w:w="5000"/>
-        <w:tblLayout w:type="fixed"/>
-        <w:tblLook w:firstRow="1" w:lastRow="0" w:firstColumn="0" w:lastColumn="0" w:noHBand="0" w:noVBand="0" w:val="0020"/>
-      </w:tblPr>
-      <w:tblGrid>
-        <w:gridCol w:w="3960"/>
-        <w:gridCol w:w="3960"/>
-      </w:tblGrid>
-      <w:tr>
-        <w:trPr>
-          <w:tblHeader w:val="on"/>
-        </w:trPr>
-        <w:tc>
-          <w:tcPr/>
-          <w:p>
-            <w:pPr>
-              <w:pStyle w:val="Compact"/>
-            </w:pPr>
-            <w:r>
-              <w:t xml:space="preserve">Figure</w:t>
-            </w:r>
-          </w:p>
-        </w:tc>
-        <w:tc>
-          <w:tcPr/>
-          <w:p>
-            <w:pPr>
-              <w:pStyle w:val="Compact"/>
-            </w:pPr>
-            <w:r>
-              <w:t xml:space="preserve">Description</w:t>
-            </w:r>
-          </w:p>
-        </w:tc>
-      </w:tr>
-      <w:tr>
-        <w:tc>
-          <w:tcPr/>
-          <w:p>
-            <w:pPr>
-              <w:pStyle w:val="Compact"/>
-            </w:pPr>
-            <w:r>
-              <w:t xml:space="preserve">Figure 1</w:t>
-            </w:r>
-          </w:p>
-        </w:tc>
-        <w:tc>
-          <w:tcPr/>
-          <w:p>
-            <w:pPr>
-              <w:pStyle w:val="Compact"/>
-            </w:pPr>
-            <w:r>
-              <w:t xml:space="preserve">PRISMA flow diagram for the literature search and screening process</w:t>
-            </w:r>
-          </w:p>
-        </w:tc>
-      </w:tr>
-      <w:tr>
-        <w:tc>
-          <w:tcPr/>
-          <w:p>
-            <w:pPr>
-              <w:pStyle w:val="Compact"/>
-            </w:pPr>
-            <w:r>
-              <w:t xml:space="preserve">Figure 2</w:t>
-            </w:r>
-          </w:p>
-        </w:tc>
-        <w:tc>
-          <w:tcPr/>
-          <w:p>
-            <w:pPr>
-              <w:pStyle w:val="Compact"/>
-            </w:pPr>
-            <w:r>
-              <w:t xml:space="preserve">Use case diagram for the cardiopulmonary sound separation system</w:t>
-            </w:r>
-          </w:p>
-        </w:tc>
-      </w:tr>
-      <w:tr>
-        <w:tc>
-          <w:tcPr/>
-          <w:p>
-            <w:pPr>
-              <w:pStyle w:val="Compact"/>
-            </w:pPr>
-            <w:r>
-              <w:t xml:space="preserve">Figure 3</w:t>
-            </w:r>
-          </w:p>
-        </w:tc>
-        <w:tc>
-          <w:tcPr/>
-          <w:p>
-            <w:pPr>
-              <w:pStyle w:val="Compact"/>
-            </w:pPr>
-            <w:r>
-              <w:t xml:space="preserve">Component diagram for the cardiopulmonary sound separation system</w:t>
-            </w:r>
-          </w:p>
-        </w:tc>
-      </w:tr>
-      <w:tr>
-        <w:tc>
-          <w:tcPr/>
-          <w:p>
-            <w:pPr>
-              <w:pStyle w:val="Compact"/>
-            </w:pPr>
-            <w:r>
-              <w:t xml:space="preserve">Figure 4</w:t>
-            </w:r>
-          </w:p>
-        </w:tc>
-        <w:tc>
-          <w:tcPr/>
-          <w:p>
-            <w:pPr>
-              <w:pStyle w:val="Compact"/>
-            </w:pPr>
-            <w:r>
-              <w:t xml:space="preserve">Audio processing workflow</w:t>
-            </w:r>
-          </w:p>
-        </w:tc>
-      </w:tr>
-      <w:tr>
-        <w:tc>
-          <w:tcPr/>
-          <w:p>
-            <w:pPr>
-              <w:pStyle w:val="Compact"/>
-            </w:pPr>
-            <w:r>
-              <w:t xml:space="preserve">Figure 5</w:t>
-            </w:r>
-          </w:p>
-        </w:tc>
-        <w:tc>
-          <w:tcPr/>
-          <w:p>
-            <w:pPr>
-              <w:pStyle w:val="Compact"/>
-            </w:pPr>
-            <w:r>
-              <w:t xml:space="preserve">Sequence diagram for audio upload and separation</w:t>
-            </w:r>
-          </w:p>
-        </w:tc>
-      </w:tr>
-    </w:tbl>
+    <w:p>
+      <w:pPr>
+        <w:pStyle w:val="TOC1"/>
+      </w:pPr>
+      <w:hyperlink w:anchor="_FYPFigure001" w:history="1">
+        <w:r>
+          <w:rPr>
+            <w:rStyle w:val="Hyperlink"/>
+          </w:rPr>
+          <w:t>Figure 2.1: PRISMA flow diagram for the literature search and screening process.</w:t>
+        </w:r>
+      </w:hyperlink>
+      <w:r>
+        <w:tab/>
+      </w:r>
+      <w:r>
+        <w:fldChar w:fldCharType="begin"/>
+      </w:r>
+      <w:r>
+        <w:instrText xml:space="preserve"> PAGEREF _FYPFigure001 \h </w:instrText>
+      </w:r>
+      <w:r>
+        <w:fldChar w:fldCharType="separate"/>
+      </w:r>
+      <w:r>
+        <w:fldChar w:fldCharType="end"/>
+      </w:r>
+    </w:p>
+    <w:p>
+      <w:pPr>
+        <w:pStyle w:val="TOC1"/>
+      </w:pPr>
+      <w:hyperlink w:anchor="_FYPFigure002" w:history="1">
+        <w:r>
+          <w:rPr>
+            <w:rStyle w:val="Hyperlink"/>
+          </w:rPr>
+          <w:t>Figure 4.1: Use case diagram for the cardiopulmonary sound separation system.</w:t>
+        </w:r>
+      </w:hyperlink>
+      <w:r>
+        <w:tab/>
+      </w:r>
+      <w:r>
+        <w:fldChar w:fldCharType="begin"/>
+      </w:r>
+      <w:r>
+        <w:instrText xml:space="preserve"> PAGEREF _FYPFigure002 \h </w:instrText>
+      </w:r>
+      <w:r>
+        <w:fldChar w:fldCharType="separate"/>
+      </w:r>
+      <w:r>
+        <w:fldChar w:fldCharType="end"/>
+      </w:r>
+    </w:p>
+    <w:p>
+      <w:pPr>
+        <w:pStyle w:val="TOC1"/>
+      </w:pPr>
+      <w:hyperlink w:anchor="_FYPFigure003" w:history="1">
+        <w:r>
+          <w:rPr>
+            <w:rStyle w:val="Hyperlink"/>
+          </w:rPr>
+          <w:t>Figure 4.2: Component diagram for the cardiopulmonary sound separation system.</w:t>
+        </w:r>
+      </w:hyperlink>
+      <w:r>
+        <w:tab/>
+      </w:r>
+      <w:r>
+        <w:fldChar w:fldCharType="begin"/>
+      </w:r>
+      <w:r>
+        <w:instrText xml:space="preserve"> PAGEREF _FYPFigure003 \h </w:instrText>
+      </w:r>
+      <w:r>
+        <w:fldChar w:fldCharType="separate"/>
+      </w:r>
+      <w:r>
+        <w:fldChar w:fldCharType="end"/>
+      </w:r>
+    </w:p>
+    <w:p>
+      <w:pPr>
+        <w:pStyle w:val="TOC1"/>
+      </w:pPr>
+      <w:hyperlink w:anchor="_FYPFigure004" w:history="1">
+        <w:r>
+          <w:rPr>
+            <w:rStyle w:val="Hyperlink"/>
+          </w:rPr>
+          <w:t>Figure 4.3: Audio processing workflow for the proposed system.</w:t>
+        </w:r>
+      </w:hyperlink>
+      <w:r>
+        <w:tab/>
+      </w:r>
+      <w:r>
+        <w:fldChar w:fldCharType="begin"/>
+      </w:r>
+      <w:r>
+        <w:instrText xml:space="preserve"> PAGEREF _FYPFigure004 \h </w:instrText>
+      </w:r>
+      <w:r>
+        <w:fldChar w:fldCharType="separate"/>
+      </w:r>
+      <w:r>
+        <w:fldChar w:fldCharType="end"/>
+      </w:r>
+    </w:p>
+    <w:p>
+      <w:pPr>
+        <w:pStyle w:val="TOC1"/>
+      </w:pPr>
+      <w:hyperlink w:anchor="_FYPFigure005" w:history="1">
+        <w:r>
+          <w:rPr>
+            <w:rStyle w:val="Hyperlink"/>
+          </w:rPr>
+          <w:t>Figure 4.4: Sequence diagram for audio upload and cardiopulmonary sound separation.</w:t>
+        </w:r>
+      </w:hyperlink>
+      <w:r>
+        <w:tab/>
+      </w:r>
+      <w:r>
+        <w:fldChar w:fldCharType="begin"/>
+      </w:r>
+      <w:r>
+        <w:instrText xml:space="preserve"> PAGEREF _FYPFigure005 \h </w:instrText>
+      </w:r>
+      <w:r>
+        <w:fldChar w:fldCharType="separate"/>
+      </w:r>
+      <w:r>
+        <w:fldChar w:fldCharType="end"/>
+      </w:r>
+    </w:p>
     <w:p>
       <w:r>
         <w:br w:type="page"/>
       </w:r>
     </w:p>
-    <w:bookmarkEnd w:id="24"/>
-    <w:bookmarkStart w:id="25" w:name="list-of-abbreviationssymbols"/>
     <w:p>
       <w:pPr>
         <w:pStyle w:val="Heading1"/>
@@ -1342,140 +1316,118 @@
         <w:t xml:space="preserve">List of Appendices</w:t>
       </w:r>
     </w:p>
-    <w:tbl>
-      <w:tblPr>
-        <w:tblStyle w:val="Table"/>
-        <w:tblW w:type="auto" w:w="0"/>
-        <w:tblLook w:firstRow="1" w:lastRow="0" w:firstColumn="0" w:lastColumn="0" w:noHBand="0" w:noVBand="0" w:val="0020"/>
-      </w:tblPr>
-      <w:tblGrid>
-        <w:gridCol w:w="3960"/>
-        <w:gridCol w:w="3960"/>
-      </w:tblGrid>
-      <w:tr>
-        <w:trPr>
-          <w:tblHeader w:val="on"/>
-        </w:trPr>
-        <w:tc>
-          <w:tcPr/>
-          <w:p>
-            <w:pPr>
-              <w:pStyle w:val="Compact"/>
-            </w:pPr>
-            <w:r>
-              <w:t xml:space="preserve">Appendix</w:t>
-            </w:r>
-          </w:p>
-        </w:tc>
-        <w:tc>
-          <w:tcPr/>
-          <w:p>
-            <w:pPr>
-              <w:pStyle w:val="Compact"/>
-            </w:pPr>
-            <w:r>
-              <w:t xml:space="preserve">Description</w:t>
-            </w:r>
-          </w:p>
-        </w:tc>
-      </w:tr>
-      <w:tr>
-        <w:tc>
-          <w:tcPr/>
-          <w:p>
-            <w:pPr>
-              <w:pStyle w:val="Compact"/>
-            </w:pPr>
-            <w:r>
-              <w:t xml:space="preserve">Appendix A</w:t>
-            </w:r>
-          </w:p>
-        </w:tc>
-        <w:tc>
-          <w:tcPr/>
-          <w:p>
-            <w:pPr>
-              <w:pStyle w:val="Compact"/>
-            </w:pPr>
-            <w:r>
-              <w:t xml:space="preserve">Full Literature Review Matrix</w:t>
-            </w:r>
-          </w:p>
-        </w:tc>
-      </w:tr>
-      <w:tr>
-        <w:tc>
-          <w:tcPr/>
-          <w:p>
-            <w:pPr>
-              <w:pStyle w:val="Compact"/>
-            </w:pPr>
-            <w:r>
-              <w:t xml:space="preserve">Appendix B</w:t>
-            </w:r>
-          </w:p>
-        </w:tc>
-        <w:tc>
-          <w:tcPr/>
-          <w:p>
-            <w:pPr>
-              <w:pStyle w:val="Compact"/>
-            </w:pPr>
-            <w:r>
-              <w:t xml:space="preserve">PRISMA Screening Summary</w:t>
-            </w:r>
-          </w:p>
-        </w:tc>
-      </w:tr>
-      <w:tr>
-        <w:tc>
-          <w:tcPr/>
-          <w:p>
-            <w:pPr>
-              <w:pStyle w:val="Compact"/>
-            </w:pPr>
-            <w:r>
-              <w:t xml:space="preserve">Appendix C</w:t>
-            </w:r>
-          </w:p>
-        </w:tc>
-        <w:tc>
-          <w:tcPr/>
-          <w:p>
-            <w:pPr>
-              <w:pStyle w:val="Compact"/>
-            </w:pPr>
-            <w:r>
-              <w:t xml:space="preserve">System Design Diagrams</w:t>
-            </w:r>
-          </w:p>
-        </w:tc>
-      </w:tr>
-      <w:tr>
-        <w:tc>
-          <w:tcPr/>
-          <w:p>
-            <w:pPr>
-              <w:pStyle w:val="Compact"/>
-            </w:pPr>
-            <w:r>
-              <w:t xml:space="preserve">Appendix D</w:t>
-            </w:r>
-          </w:p>
-        </w:tc>
-        <w:tc>
-          <w:tcPr/>
-          <w:p>
-            <w:pPr>
-              <w:pStyle w:val="Compact"/>
-            </w:pPr>
-            <w:r>
-              <w:t xml:space="preserve">Planned Test Cases and Evaluation Metrics</w:t>
-            </w:r>
-          </w:p>
-        </w:tc>
-      </w:tr>
-    </w:tbl>
+    <w:p>
+      <w:pPr>
+        <w:pStyle w:val="TOC1"/>
+      </w:pPr>
+      <w:hyperlink w:anchor="_FYPAppendix001" w:history="1">
+        <w:r>
+          <w:rPr>
+            <w:rStyle w:val="Hyperlink"/>
+          </w:rPr>
+          <w:t>Appendix A: Full Literature Review Matrix</w:t>
+        </w:r>
+      </w:hyperlink>
+      <w:r>
+        <w:tab/>
+      </w:r>
+      <w:r>
+        <w:fldChar w:fldCharType="begin"/>
+      </w:r>
+      <w:r>
+        <w:instrText xml:space="preserve"> PAGEREF _FYPAppendix001 \h </w:instrText>
+      </w:r>
+      <w:r>
+        <w:fldChar w:fldCharType="separate"/>
+      </w:r>
+      <w:r>
+        <w:fldChar w:fldCharType="end"/>
+      </w:r>
+    </w:p>
+    <w:p>
+      <w:pPr>
+        <w:pStyle w:val="TOC1"/>
+      </w:pPr>
+      <w:hyperlink w:anchor="_FYPAppendix002" w:history="1">
+        <w:r>
+          <w:rPr>
+            <w:rStyle w:val="Hyperlink"/>
+          </w:rPr>
+          <w:t>Appendix B: PRISMA Screening Summary</w:t>
+        </w:r>
+      </w:hyperlink>
+      <w:r>
+        <w:tab/>
+      </w:r>
+      <w:r>
+        <w:fldChar w:fldCharType="begin"/>
+      </w:r>
+      <w:r>
+        <w:instrText xml:space="preserve"> PAGEREF _FYPAppendix002 \h </w:instrText>
+      </w:r>
+      <w:r>
+        <w:fldChar w:fldCharType="separate"/>
+      </w:r>
+      <w:r>
+        <w:fldChar w:fldCharType="end"/>
+      </w:r>
+    </w:p>
+    <w:p>
+      <w:pPr>
+        <w:pStyle w:val="TOC1"/>
+      </w:pPr>
+      <w:hyperlink w:anchor="_FYPAppendix003" w:history="1">
+        <w:r>
+          <w:rPr>
+            <w:rStyle w:val="Hyperlink"/>
+          </w:rPr>
+          <w:t>Appendix C: System Design Diagrams</w:t>
+        </w:r>
+      </w:hyperlink>
+      <w:r>
+        <w:tab/>
+      </w:r>
+      <w:r>
+        <w:fldChar w:fldCharType="begin"/>
+      </w:r>
+      <w:r>
+        <w:instrText xml:space="preserve"> PAGEREF _FYPAppendix003 \h </w:instrText>
+      </w:r>
+      <w:r>
+        <w:fldChar w:fldCharType="separate"/>
+      </w:r>
+      <w:r>
+        <w:fldChar w:fldCharType="end"/>
+      </w:r>
+    </w:p>
+    <w:p>
+      <w:pPr>
+        <w:pStyle w:val="TOC1"/>
+      </w:pPr>
+      <w:hyperlink w:anchor="_FYPAppendix004" w:history="1">
+        <w:r>
+          <w:rPr>
+            <w:rStyle w:val="Hyperlink"/>
+          </w:rPr>
+          <w:t>Appendix D: Planned Test Cases and Evaluation Metrics</w:t>
+        </w:r>
+      </w:hyperlink>
+      <w:r>
+        <w:tab/>
+      </w:r>
+      <w:r>
+        <w:fldChar w:fldCharType="begin"/>
+      </w:r>
+      <w:r>
+        <w:instrText xml:space="preserve"> PAGEREF _FYPAppendix004 \h </w:instrText>
+      </w:r>
+      <w:r>
+        <w:fldChar w:fldCharType="separate"/>
+      </w:r>
+      <w:r>
+        <w:fldChar w:fldCharType="end"/>
+      </w:r>
+    </w:p>
     <w:p>
       <w:pPr>
         <w:sectPr>
@@ -1491,8 +1443,6 @@
         <w:br w:type="page"/>
       </w:r>
     </w:p>
-    <w:bookmarkEnd w:id="26"/>
-    <w:bookmarkStart w:id="35" w:name="chapter-1-introduction"/>
     <w:p>
       <w:pPr>
         <w:pStyle w:val="Heading1"/>
@@ -2508,6 +2458,7 @@
             <w:pPr>
               <w:jc w:val="center"/>
             </w:pPr>
+            <w:bookmarkStart w:id="201" w:name="_FYPFigure001"/>
             <w:pPr>
               <w:jc w:val="left"/>
               <w:spacing w:before="200"/>
@@ -2516,6 +2467,7 @@
             <w:r>
               <w:t xml:space="preserve">Figure 2.1: PRISMA flow diagram for the literature search and screening process.</w:t>
             </w:r>
+            <w:bookmarkEnd w:id="201"/>
           </w:p>
           <w:bookmarkEnd w:id="41"/>
         </w:tc>
@@ -2557,6 +2509,7 @@
             <w:pPr>
               <w:jc w:val="center"/>
             </w:pPr>
+            <w:bookmarkStart w:id="192" w:name="_FYPTable001"/>
             <w:pPr>
               <w:jc w:val="left"/>
               <w:spacing w:before="200"/>
@@ -2565,6 +2518,7 @@
             <w:r>
               <w:t xml:space="preserve">Table 2.1: Summary literature review matrix for key cardiopulmonary sound separation studies</w:t>
             </w:r>
+            <w:bookmarkEnd w:id="192"/>
           </w:p>
           <w:tbl>
             <w:tblPr>
@@ -8520,6 +8474,7 @@
             <w:pPr>
               <w:jc w:val="center"/>
             </w:pPr>
+            <w:bookmarkStart w:id="202" w:name="_FYPFigure002"/>
             <w:pPr>
               <w:jc w:val="left"/>
               <w:spacing w:before="200"/>
@@ -8528,6 +8483,7 @@
             <w:r>
               <w:t xml:space="preserve">Figure 4.1: Use case diagram for the cardiopulmonary sound separation system.</w:t>
             </w:r>
+            <w:bookmarkEnd w:id="202"/>
           </w:p>
           <w:bookmarkEnd w:id="72"/>
         </w:tc>
@@ -8639,6 +8595,7 @@
             <w:pPr>
               <w:jc w:val="center"/>
             </w:pPr>
+            <w:bookmarkStart w:id="203" w:name="_FYPFigure003"/>
             <w:pPr>
               <w:jc w:val="left"/>
               <w:spacing w:before="200"/>
@@ -8647,6 +8604,7 @@
             <w:r>
               <w:t xml:space="preserve">Figure 4.2: Component diagram for the cardiopulmonary sound separation system.</w:t>
             </w:r>
+            <w:bookmarkEnd w:id="203"/>
           </w:p>
           <w:bookmarkEnd w:id="77"/>
         </w:tc>
@@ -8702,6 +8660,7 @@
             <w:pPr>
               <w:jc w:val="center"/>
             </w:pPr>
+            <w:bookmarkStart w:id="193" w:name="_FYPTable002"/>
             <w:pPr>
               <w:jc w:val="left"/>
               <w:spacing w:before="200"/>
@@ -8710,6 +8669,7 @@
             <w:r>
               <w:t xml:space="preserve">Table 4.1: Main system modules and responsibilities</w:t>
             </w:r>
+            <w:bookmarkEnd w:id="193"/>
           </w:p>
           <w:tbl>
             <w:tblPr>
@@ -9147,6 +9107,7 @@
             <w:pPr>
               <w:jc w:val="center"/>
             </w:pPr>
+            <w:bookmarkStart w:id="194" w:name="_FYPTable003"/>
             <w:pPr>
               <w:jc w:val="left"/>
               <w:spacing w:before="200"/>
@@ -9155,6 +9116,7 @@
             <w:r>
               <w:t xml:space="preserve">Table 4.2: Planned database and storage records</w:t>
             </w:r>
+            <w:bookmarkEnd w:id="194"/>
           </w:p>
           <w:tbl>
             <w:tblPr>
@@ -9519,6 +9481,7 @@
             <w:pPr>
               <w:jc w:val="center"/>
             </w:pPr>
+            <w:bookmarkStart w:id="204" w:name="_FYPFigure004"/>
             <w:pPr>
               <w:jc w:val="left"/>
               <w:spacing w:before="200"/>
@@ -9527,6 +9490,7 @@
             <w:r>
               <w:t xml:space="preserve">Figure 4.3: Audio processing workflow for the proposed system.</w:t>
             </w:r>
+            <w:bookmarkEnd w:id="204"/>
           </w:p>
           <w:bookmarkEnd w:id="86"/>
         </w:tc>
@@ -9738,6 +9702,7 @@
             <w:pPr>
               <w:jc w:val="center"/>
             </w:pPr>
+            <w:bookmarkStart w:id="205" w:name="_FYPFigure005"/>
             <w:pPr>
               <w:jc w:val="left"/>
               <w:spacing w:before="200"/>
@@ -9746,6 +9711,7 @@
             <w:r>
               <w:t xml:space="preserve">Figure 4.4: Sequence diagram for audio upload and cardiopulmonary sound separation.</w:t>
             </w:r>
+            <w:bookmarkEnd w:id="205"/>
           </w:p>
           <w:bookmarkEnd w:id="93"/>
         </w:tc>
@@ -10200,6 +10166,7 @@
             <w:pPr>
               <w:jc w:val="center"/>
             </w:pPr>
+            <w:bookmarkStart w:id="195" w:name="_FYPTable004"/>
             <w:pPr>
               <w:jc w:val="left"/>
               <w:spacing w:before="200"/>
@@ -10208,6 +10175,7 @@
             <w:r>
               <w:t xml:space="preserve">Table 5.1: Planned functional test cases</w:t>
             </w:r>
+            <w:bookmarkEnd w:id="195"/>
           </w:p>
           <w:tbl>
             <w:tblPr>
@@ -10974,6 +10942,7 @@
             <w:pPr>
               <w:jc w:val="center"/>
             </w:pPr>
+            <w:bookmarkStart w:id="196" w:name="_FYPTable005"/>
             <w:pPr>
               <w:jc w:val="left"/>
               <w:spacing w:before="200"/>
@@ -10982,6 +10951,7 @@
             <w:r>
               <w:t xml:space="preserve">Table 5.2: Planned audio separation evaluation metrics</w:t>
             </w:r>
+            <w:bookmarkEnd w:id="196"/>
           </w:p>
           <w:tbl>
             <w:tblPr>
@@ -12963,9 +12933,11 @@
       <w:pPr>
         <w:pStyle w:val="Heading1"/>
       </w:pPr>
+      <w:bookmarkStart w:id="206" w:name="_FYPAppendix001"/>
       <w:r>
         <w:t xml:space="preserve">Appendix A: Full Literature Review Matrix</w:t>
       </w:r>
+      <w:bookmarkEnd w:id="206"/>
     </w:p>
     <w:p>
       <w:pPr>
@@ -13014,6 +12986,7 @@
               <w:jc w:val="center"/>
               <w:spacing w:before="0" w:after="0" w:line="180" w:lineRule="auto"/>
             </w:pPr>
+            <w:bookmarkStart w:id="197" w:name="_FYPTable006"/>
             <w:pPr>
               <w:jc w:val="left"/>
               <w:spacing w:before="200"/>
@@ -13029,6 +13002,7 @@
               </w:rPr>
               <w:t xml:space="preserve">Table 5.3: Full literature review matrix for selected Chapter 2 papers</w:t>
             </w:r>
+            <w:bookmarkEnd w:id="197"/>
           </w:p>
           <w:tbl>
             <w:tblPr>
@@ -22616,9 +22590,11 @@
       <w:pPr>
         <w:pStyle w:val="Heading1"/>
       </w:pPr>
+      <w:bookmarkStart w:id="207" w:name="_FYPAppendix002"/>
       <w:r>
         <w:t xml:space="preserve">Appendix B: PRISMA Screening Summary</w:t>
       </w:r>
+      <w:bookmarkEnd w:id="207"/>
     </w:p>
     <w:p>
       <w:pPr>
@@ -22646,6 +22622,7 @@
             <w:pPr>
               <w:jc w:val="center"/>
             </w:pPr>
+            <w:bookmarkStart w:id="198" w:name="_FYPTable007"/>
             <w:pPr>
               <w:jc w:val="left"/>
               <w:spacing w:before="200"/>
@@ -22654,6 +22631,7 @@
             <w:r>
               <w:t xml:space="preserve">Table 5.4: PRISMA screening summary for the literature review</w:t>
             </w:r>
+            <w:bookmarkEnd w:id="198"/>
           </w:p>
           <w:tbl>
             <w:tblPr>
@@ -22999,9 +22977,11 @@
       <w:pPr>
         <w:pStyle w:val="Heading1"/>
       </w:pPr>
+      <w:bookmarkStart w:id="208" w:name="_FYPAppendix003"/>
       <w:r>
         <w:t xml:space="preserve">Appendix C: System Design Diagrams</w:t>
       </w:r>
+      <w:bookmarkEnd w:id="208"/>
     </w:p>
     <w:p>
       <w:pPr>
@@ -23029,6 +23009,7 @@
             <w:pPr>
               <w:jc w:val="center"/>
             </w:pPr>
+            <w:bookmarkStart w:id="199" w:name="_FYPTable008"/>
             <w:pPr>
               <w:jc w:val="left"/>
               <w:spacing w:before="200"/>
@@ -23037,6 +23018,7 @@
             <w:r>
               <w:t xml:space="preserve">Table 5.5: System design diagram summary</w:t>
             </w:r>
+            <w:bookmarkEnd w:id="199"/>
           </w:p>
           <w:tbl>
             <w:tblPr>
@@ -23199,9 +23181,11 @@
       <w:pPr>
         <w:pStyle w:val="Heading1"/>
       </w:pPr>
+      <w:bookmarkStart w:id="209" w:name="_FYPAppendix004"/>
       <w:r>
         <w:t xml:space="preserve">Appendix D: Planned Test Cases and Evaluation Metrics</w:t>
       </w:r>
+      <w:bookmarkEnd w:id="209"/>
     </w:p>
     <w:p>
       <w:pPr>
@@ -23229,6 +23213,7 @@
             <w:pPr>
               <w:jc w:val="center"/>
             </w:pPr>
+            <w:bookmarkStart w:id="200" w:name="_FYPTable009"/>
             <w:pPr>
               <w:jc w:val="left"/>
               <w:spacing w:before="200"/>
@@ -23237,6 +23222,7 @@
             <w:r>
               <w:t xml:space="preserve">Table 5.6: Appendix planned test cases and evaluation checks</w:t>
             </w:r>
+            <w:bookmarkEnd w:id="200"/>
           </w:p>
           <w:tbl>
             <w:tblPr>

</xml_diff>